<commit_message>
Apply CQC colour scheme from colour template to all documents
Recolour the six design documents to match the CQC brand palette
defined in colour template.docx, replacing their various blue Azure
schemes:
- Brand/header fills + headings -> CQC purple #5F2861 / #7030A0
- Azure accent blue (#0078D4) and rust (#C45911) folded into purple
- Light blue banding/callout fills -> light purple tints
- Neutral greys and grid borders normalised to template greys
- Heading runs on purple fills set to white for readability
- Functional colours preserved (status red/amber/green, terminal/code
  blocks, hyperlink blue)

Also add colour template.docx as the brand palette reference.

Co-Authored-By: Claude Opus 4.8 (1M context) <noreply@anthropic.com>
</commit_message>
<xml_diff>
--- a/Azure_Landing_Zone_Design_Template_KIMI.docx
+++ b/Azure_Landing_Zone_Design_Template_KIMI.docx
@@ -61,7 +61,7 @@
       </w:pPr>
       <w:r>
         <w:rPr>
-          <w:color w:val="1e3a5f"/>
+          <w:color w:val="7030A0"/>
           <w:spacing w:val="30"/>
           <w:sz w:val="80"/>
         </w:rPr>
@@ -76,7 +76,7 @@
       </w:pPr>
       <w:r>
         <w:rPr>
-          <w:color w:val="0078d4"/>
+          <w:color w:val="7030A0"/>
           <w:spacing w:val="20"/>
           <w:sz w:val="56"/>
         </w:rPr>
@@ -91,7 +91,7 @@
       </w:pPr>
       <w:r>
         <w:rPr>
-          <w:color w:val="4a5568"/>
+          <w:color w:val="404040"/>
           <w:spacing w:val="30"/>
           <w:sz w:val="24"/>
         </w:rPr>
@@ -106,7 +106,7 @@
       </w:pPr>
       <w:r>
         <w:rPr>
-          <w:color w:val="718096"/>
+          <w:color w:val="646464"/>
           <w:sz w:val="20"/>
         </w:rPr>
         <w:t>Cloud Adoption Framework (CAF) | Enterprise-Scale Architecture</w:t>
@@ -118,7 +118,7 @@
       </w:pPr>
       <w:r>
         <w:rPr>
-          <w:color w:val="718096"/>
+          <w:color w:val="646464"/>
           <w:sz w:val="20"/>
         </w:rPr>
         <w:t>May 2026 Edition</w:t>
@@ -150,7 +150,7 @@
       </w:pPr>
       <w:r>
         <w:rPr>
-          <w:color w:val="718096"/>
+          <w:color w:val="646464"/>
           <w:sz w:val="18"/>
         </w:rPr>
         <w:t>Right-click the TOC and select "Update Field" to refresh page numbers</w:t>
@@ -572,9 +572,9 @@
       <w:tblPr>
         <w:tblW w:w="5000" w:type="pct"/>
         <w:tblBorders>
-          <w:top w:val="single" w:color="1e3a5f" w:sz="12"/>
-          <w:bottom w:val="single" w:color="1e3a5f" w:sz="12"/>
-          <w:insideH w:val="single" w:color="cbd5e0" w:sz="4"/>
+          <w:top w:val="single" w:color="5F2861" w:sz="12"/>
+          <w:bottom w:val="single" w:color="5F2861" w:sz="12"/>
+          <w:insideH w:val="single" w:color="D9D9D9" w:sz="4"/>
         </w:tblBorders>
       </w:tblPr>
       <w:tblGrid>
@@ -589,7 +589,7 @@
         <w:tc>
           <w:tcPr>
             <w:tcW w:w="2200" w:type="dxa"/>
-            <w:shd w:val="clear" w:fill="e8eef4"/>
+            <w:shd w:val="clear" w:fill="F2EEF2"/>
           </w:tcPr>
           <w:p>
             <w:pPr>
@@ -609,7 +609,7 @@
         <w:tc>
           <w:tcPr>
             <w:tcW w:w="4500" w:type="dxa"/>
-            <w:shd w:val="clear" w:fill="e8eef4"/>
+            <w:shd w:val="clear" w:fill="F2EEF2"/>
           </w:tcPr>
           <w:p>
             <w:pPr>
@@ -629,7 +629,7 @@
         <w:tc>
           <w:tcPr>
             <w:tcW w:w="3300" w:type="dxa"/>
-            <w:shd w:val="clear" w:fill="e8eef4"/>
+            <w:shd w:val="clear" w:fill="F2EEF2"/>
           </w:tcPr>
           <w:p>
             <w:pPr>
@@ -659,7 +659,7 @@
             </w:pPr>
             <w:r>
               <w:rPr>
-                <w:color w:val="4a5568"/>
+                <w:color w:val="404040"/>
                 <w:sz w:val="20"/>
               </w:rPr>
               <w:t>Environment</w:t>
@@ -677,7 +677,7 @@
             </w:pPr>
             <w:r>
               <w:rPr>
-                <w:color w:val="4a5568"/>
+                <w:color w:val="404040"/>
                 <w:sz w:val="20"/>
               </w:rPr>
               <w:t>Azure Billing &amp; Entra Tenant</w:t>
@@ -695,7 +695,7 @@
             </w:pPr>
             <w:r>
               <w:rPr>
-                <w:color w:val="4a5568"/>
+                <w:color w:val="404040"/>
                 <w:sz w:val="20"/>
               </w:rPr>
               <w:t>EA/MCA enrollment; billing scopes; tenant provisioning</w:t>
@@ -715,7 +715,7 @@
             </w:pPr>
             <w:r>
               <w:rPr>
-                <w:color w:val="4a5568"/>
+                <w:color w:val="404040"/>
                 <w:sz w:val="20"/>
               </w:rPr>
               <w:t>Environment</w:t>
@@ -733,7 +733,7 @@
             </w:pPr>
             <w:r>
               <w:rPr>
-                <w:color w:val="4a5568"/>
+                <w:color w:val="404040"/>
                 <w:sz w:val="20"/>
               </w:rPr>
               <w:t>Identity &amp; Access Management</w:t>
@@ -751,7 +751,7 @@
             </w:pPr>
             <w:r>
               <w:rPr>
-                <w:color w:val="4a5568"/>
+                <w:color w:val="404040"/>
                 <w:sz w:val="20"/>
               </w:rPr>
               <w:t>Entra ID; PIM; MFA; RBAC; conditional access</w:t>
@@ -771,7 +771,7 @@
             </w:pPr>
             <w:r>
               <w:rPr>
-                <w:color w:val="4a5568"/>
+                <w:color w:val="404040"/>
                 <w:sz w:val="20"/>
               </w:rPr>
               <w:t>Environment</w:t>
@@ -789,7 +789,7 @@
             </w:pPr>
             <w:r>
               <w:rPr>
-                <w:color w:val="4a5568"/>
+                <w:color w:val="404040"/>
                 <w:sz w:val="20"/>
               </w:rPr>
               <w:t>Resource Organization</w:t>
@@ -807,7 +807,7 @@
             </w:pPr>
             <w:r>
               <w:rPr>
-                <w:color w:val="4a5568"/>
+                <w:color w:val="404040"/>
                 <w:sz w:val="20"/>
               </w:rPr>
               <w:t>Management groups; subscription vending; tagging</w:t>
@@ -827,7 +827,7 @@
             </w:pPr>
             <w:r>
               <w:rPr>
-                <w:color w:val="4a5568"/>
+                <w:color w:val="404040"/>
                 <w:sz w:val="20"/>
               </w:rPr>
               <w:t>Environment</w:t>
@@ -845,7 +845,7 @@
             </w:pPr>
             <w:r>
               <w:rPr>
-                <w:color w:val="4a5568"/>
+                <w:color w:val="404040"/>
                 <w:sz w:val="20"/>
               </w:rPr>
               <w:t>Network Topology &amp; Connectivity</w:t>
@@ -863,7 +863,7 @@
             </w:pPr>
             <w:r>
               <w:rPr>
-                <w:color w:val="4a5568"/>
+                <w:color w:val="404040"/>
                 <w:sz w:val="20"/>
               </w:rPr>
               <w:t>Hub/spoke or vWAN; Firewall; Private DNS; ExpressRoute</w:t>
@@ -883,7 +883,7 @@
             </w:pPr>
             <w:r>
               <w:rPr>
-                <w:color w:val="4a5568"/>
+                <w:color w:val="404040"/>
                 <w:sz w:val="20"/>
               </w:rPr>
               <w:t>Compliance</w:t>
@@ -901,7 +901,7 @@
             </w:pPr>
             <w:r>
               <w:rPr>
-                <w:color w:val="4a5568"/>
+                <w:color w:val="404040"/>
                 <w:sz w:val="20"/>
               </w:rPr>
               <w:t>Security</w:t>
@@ -919,7 +919,7 @@
             </w:pPr>
             <w:r>
               <w:rPr>
-                <w:color w:val="4a5568"/>
+                <w:color w:val="404040"/>
                 <w:sz w:val="20"/>
               </w:rPr>
               <w:t>Defender for Cloud; Sentinel; Key Vault; encryption</w:t>
@@ -939,7 +939,7 @@
             </w:pPr>
             <w:r>
               <w:rPr>
-                <w:color w:val="4a5568"/>
+                <w:color w:val="404040"/>
                 <w:sz w:val="20"/>
               </w:rPr>
               <w:t>Compliance</w:t>
@@ -957,7 +957,7 @@
             </w:pPr>
             <w:r>
               <w:rPr>
-                <w:color w:val="4a5568"/>
+                <w:color w:val="404040"/>
                 <w:sz w:val="20"/>
               </w:rPr>
               <w:t>Management</w:t>
@@ -975,7 +975,7 @@
             </w:pPr>
             <w:r>
               <w:rPr>
-                <w:color w:val="4a5568"/>
+                <w:color w:val="404040"/>
                 <w:sz w:val="20"/>
               </w:rPr>
               <w:t>Monitor; Log Analytics; Backup; Update Manager</w:t>
@@ -995,7 +995,7 @@
             </w:pPr>
             <w:r>
               <w:rPr>
-                <w:color w:val="4a5568"/>
+                <w:color w:val="404040"/>
                 <w:sz w:val="20"/>
               </w:rPr>
               <w:t>Compliance</w:t>
@@ -1013,7 +1013,7 @@
             </w:pPr>
             <w:r>
               <w:rPr>
-                <w:color w:val="4a5568"/>
+                <w:color w:val="404040"/>
                 <w:sz w:val="20"/>
               </w:rPr>
               <w:t>Governance</w:t>
@@ -1031,7 +1031,7 @@
             </w:pPr>
             <w:r>
               <w:rPr>
-                <w:color w:val="4a5568"/>
+                <w:color w:val="404040"/>
                 <w:sz w:val="20"/>
               </w:rPr>
               <w:t>Azure Policy; compliance initiatives; Cost Management</w:t>
@@ -1051,7 +1051,7 @@
             </w:pPr>
             <w:r>
               <w:rPr>
-                <w:color w:val="4a5568"/>
+                <w:color w:val="404040"/>
                 <w:sz w:val="20"/>
               </w:rPr>
               <w:t>Compliance</w:t>
@@ -1069,7 +1069,7 @@
             </w:pPr>
             <w:r>
               <w:rPr>
-                <w:color w:val="4a5568"/>
+                <w:color w:val="404040"/>
                 <w:sz w:val="20"/>
               </w:rPr>
               <w:t>Platform Automation &amp; DevOps</w:t>
@@ -1087,7 +1087,7 @@
             </w:pPr>
             <w:r>
               <w:rPr>
-                <w:color w:val="4a5568"/>
+                <w:color w:val="404040"/>
                 <w:sz w:val="20"/>
               </w:rPr>
               <w:t>IaC; AVM; CI/CD; canary testing</w:t>
@@ -1209,9 +1209,9 @@
       <w:tblPr>
         <w:tblW w:w="5000" w:type="pct"/>
         <w:tblBorders>
-          <w:top w:val="single" w:color="1e3a5f" w:sz="12"/>
-          <w:bottom w:val="single" w:color="1e3a5f" w:sz="12"/>
-          <w:insideH w:val="single" w:color="cbd5e0" w:sz="4"/>
+          <w:top w:val="single" w:color="5F2861" w:sz="12"/>
+          <w:bottom w:val="single" w:color="5F2861" w:sz="12"/>
+          <w:insideH w:val="single" w:color="D9D9D9" w:sz="4"/>
         </w:tblBorders>
       </w:tblPr>
       <w:tblGrid>
@@ -1226,7 +1226,7 @@
         <w:tc>
           <w:tcPr>
             <w:tcW w:w="1400" w:type="dxa"/>
-            <w:shd w:val="clear" w:fill="e8eef4"/>
+            <w:shd w:val="clear" w:fill="F2EEF2"/>
           </w:tcPr>
           <w:p>
             <w:pPr>
@@ -1246,7 +1246,7 @@
         <w:tc>
           <w:tcPr>
             <w:tcW w:w="3600" w:type="dxa"/>
-            <w:shd w:val="clear" w:fill="e8eef4"/>
+            <w:shd w:val="clear" w:fill="F2EEF2"/>
           </w:tcPr>
           <w:p>
             <w:pPr>
@@ -1266,7 +1266,7 @@
         <w:tc>
           <w:tcPr>
             <w:tcW w:w="5000" w:type="dxa"/>
-            <w:shd w:val="clear" w:fill="e8eef4"/>
+            <w:shd w:val="clear" w:fill="F2EEF2"/>
           </w:tcPr>
           <w:p>
             <w:pPr>
@@ -1296,7 +1296,7 @@
             </w:pPr>
             <w:r>
               <w:rPr>
-                <w:color w:val="4a5568"/>
+                <w:color w:val="404040"/>
                 <w:sz w:val="20"/>
               </w:rPr>
               <w:t>CIS 6.7</w:t>
@@ -1314,7 +1314,7 @@
             </w:pPr>
             <w:r>
               <w:rPr>
-                <w:color w:val="4a5568"/>
+                <w:color w:val="404040"/>
                 <w:sz w:val="20"/>
               </w:rPr>
               <w:t>Centralize identity and authentication while ensuring isolation</w:t>
@@ -1332,7 +1332,7 @@
             </w:pPr>
             <w:r>
               <w:rPr>
-                <w:color w:val="4a5568"/>
+                <w:color w:val="404040"/>
                 <w:sz w:val="20"/>
               </w:rPr>
               <w:t>Single authoritative Entra tenant with conditional access policies</w:t>
@@ -1352,7 +1352,7 @@
             </w:pPr>
             <w:r>
               <w:rPr>
-                <w:color w:val="4a5568"/>
+                <w:color w:val="404040"/>
                 <w:sz w:val="20"/>
               </w:rPr>
               <w:t>CIS 16.1</w:t>
@@ -1370,7 +1370,7 @@
             </w:pPr>
             <w:r>
               <w:rPr>
-                <w:color w:val="4a5568"/>
+                <w:color w:val="404040"/>
                 <w:sz w:val="20"/>
               </w:rPr>
               <w:t>Establish and maintain an inventory of assets</w:t>
@@ -1388,7 +1388,7 @@
             </w:pPr>
             <w:r>
               <w:rPr>
-                <w:color w:val="4a5568"/>
+                <w:color w:val="404040"/>
                 <w:sz w:val="20"/>
               </w:rPr>
               <w:t>Azure Billing enrollment tracking all subscriptions</w:t>
@@ -1582,9 +1582,9 @@
       <w:tblPr>
         <w:tblW w:w="5000" w:type="pct"/>
         <w:tblBorders>
-          <w:top w:val="single" w:color="1e3a5f" w:sz="12"/>
-          <w:bottom w:val="single" w:color="1e3a5f" w:sz="12"/>
-          <w:insideH w:val="single" w:color="cbd5e0" w:sz="4"/>
+          <w:top w:val="single" w:color="5F2861" w:sz="12"/>
+          <w:bottom w:val="single" w:color="5F2861" w:sz="12"/>
+          <w:insideH w:val="single" w:color="D9D9D9" w:sz="4"/>
         </w:tblBorders>
       </w:tblPr>
       <w:tblGrid>
@@ -1599,7 +1599,7 @@
         <w:tc>
           <w:tcPr>
             <w:tcW w:w="1400" w:type="dxa"/>
-            <w:shd w:val="clear" w:fill="e8eef4"/>
+            <w:shd w:val="clear" w:fill="F2EEF2"/>
           </w:tcPr>
           <w:p>
             <w:pPr>
@@ -1619,7 +1619,7 @@
         <w:tc>
           <w:tcPr>
             <w:tcW w:w="3600" w:type="dxa"/>
-            <w:shd w:val="clear" w:fill="e8eef4"/>
+            <w:shd w:val="clear" w:fill="F2EEF2"/>
           </w:tcPr>
           <w:p>
             <w:pPr>
@@ -1639,7 +1639,7 @@
         <w:tc>
           <w:tcPr>
             <w:tcW w:w="5000" w:type="dxa"/>
-            <w:shd w:val="clear" w:fill="e8eef4"/>
+            <w:shd w:val="clear" w:fill="F2EEF2"/>
           </w:tcPr>
           <w:p>
             <w:pPr>
@@ -1669,7 +1669,7 @@
             </w:pPr>
             <w:r>
               <w:rPr>
-                <w:color w:val="4a5568"/>
+                <w:color w:val="404040"/>
                 <w:sz w:val="20"/>
               </w:rPr>
               <w:t>CIS 5.4</w:t>
@@ -1687,7 +1687,7 @@
             </w:pPr>
             <w:r>
               <w:rPr>
-                <w:color w:val="4a5568"/>
+                <w:color w:val="404040"/>
                 <w:sz w:val="20"/>
               </w:rPr>
               <w:t>Restrict Administrator Privileges to Dedicated Accounts</w:t>
@@ -1705,7 +1705,7 @@
             </w:pPr>
             <w:r>
               <w:rPr>
-                <w:color w:val="4a5568"/>
+                <w:color w:val="404040"/>
                 <w:sz w:val="20"/>
               </w:rPr>
               <w:t>PIM for just-in-time admin access; separate admin accounts</w:t>
@@ -1725,7 +1725,7 @@
             </w:pPr>
             <w:r>
               <w:rPr>
-                <w:color w:val="4a5568"/>
+                <w:color w:val="404040"/>
                 <w:sz w:val="20"/>
               </w:rPr>
               <w:t>CIS 6.3</w:t>
@@ -1743,7 +1743,7 @@
             </w:pPr>
             <w:r>
               <w:rPr>
-                <w:color w:val="4a5568"/>
+                <w:color w:val="404040"/>
                 <w:sz w:val="20"/>
               </w:rPr>
               <w:t>Require MFA for Externally-Exposed Applications</w:t>
@@ -1761,7 +1761,7 @@
             </w:pPr>
             <w:r>
               <w:rPr>
-                <w:color w:val="4a5568"/>
+                <w:color w:val="404040"/>
                 <w:sz w:val="20"/>
               </w:rPr>
               <w:t>MFA enforcement via Conditional Access</w:t>
@@ -1781,7 +1781,7 @@
             </w:pPr>
             <w:r>
               <w:rPr>
-                <w:color w:val="4a5568"/>
+                <w:color w:val="404040"/>
                 <w:sz w:val="20"/>
               </w:rPr>
               <w:t>CIS 6.4</w:t>
@@ -1799,7 +1799,7 @@
             </w:pPr>
             <w:r>
               <w:rPr>
-                <w:color w:val="4a5568"/>
+                <w:color w:val="404040"/>
                 <w:sz w:val="20"/>
               </w:rPr>
               <w:t>Require MFA for All Services</w:t>
@@ -1817,7 +1817,7 @@
             </w:pPr>
             <w:r>
               <w:rPr>
-                <w:color w:val="4a5568"/>
+                <w:color w:val="404040"/>
                 <w:sz w:val="20"/>
               </w:rPr>
               <w:t>MFA for all users; phishing-resistant methods preferred</w:t>
@@ -1837,7 +1837,7 @@
             </w:pPr>
             <w:r>
               <w:rPr>
-                <w:color w:val="4a5568"/>
+                <w:color w:val="404040"/>
                 <w:sz w:val="20"/>
               </w:rPr>
               <w:t>CIS 6.5</w:t>
@@ -1855,7 +1855,7 @@
             </w:pPr>
             <w:r>
               <w:rPr>
-                <w:color w:val="4a5568"/>
+                <w:color w:val="404040"/>
                 <w:sz w:val="20"/>
               </w:rPr>
               <w:t>Require MFA for Administrative Access</w:t>
@@ -1873,7 +1873,7 @@
             </w:pPr>
             <w:r>
               <w:rPr>
-                <w:color w:val="4a5568"/>
+                <w:color w:val="404040"/>
                 <w:sz w:val="20"/>
               </w:rPr>
               <w:t>PIM activation requires MFA; break-glass monitoring</w:t>
@@ -1893,7 +1893,7 @@
             </w:pPr>
             <w:r>
               <w:rPr>
-                <w:color w:val="4a5568"/>
+                <w:color w:val="404040"/>
                 <w:sz w:val="20"/>
               </w:rPr>
               <w:t>CIS 6.7</w:t>
@@ -1911,7 +1911,7 @@
             </w:pPr>
             <w:r>
               <w:rPr>
-                <w:color w:val="4a5568"/>
+                <w:color w:val="404040"/>
                 <w:sz w:val="20"/>
               </w:rPr>
               <w:t>Centralize Identity and Access Management</w:t>
@@ -1929,7 +1929,7 @@
             </w:pPr>
             <w:r>
               <w:rPr>
-                <w:color w:val="4a5568"/>
+                <w:color w:val="404040"/>
                 <w:sz w:val="20"/>
               </w:rPr>
               <w:t>Microsoft Entra ID as centralized identity provider</w:t>
@@ -1949,7 +1949,7 @@
             </w:pPr>
             <w:r>
               <w:rPr>
-                <w:color w:val="4a5568"/>
+                <w:color w:val="404040"/>
                 <w:sz w:val="20"/>
               </w:rPr>
               <w:t>CIS 6.8</w:t>
@@ -1967,7 +1967,7 @@
             </w:pPr>
             <w:r>
               <w:rPr>
-                <w:color w:val="4a5568"/>
+                <w:color w:val="404040"/>
                 <w:sz w:val="20"/>
               </w:rPr>
               <w:t>Define and Maintain Role-Based Access Control</w:t>
@@ -1985,7 +1985,7 @@
             </w:pPr>
             <w:r>
               <w:rPr>
-                <w:color w:val="4a5568"/>
+                <w:color w:val="404040"/>
                 <w:sz w:val="20"/>
               </w:rPr>
               <w:t>RBAC at management group scope; least privilege principle</w:t>
@@ -2031,9 +2031,9 @@
       <w:tblPr>
         <w:tblW w:w="5000" w:type="pct"/>
         <w:tblBorders>
-          <w:top w:val="single" w:color="1e3a5f" w:sz="12"/>
-          <w:bottom w:val="single" w:color="1e3a5f" w:sz="12"/>
-          <w:insideH w:val="single" w:color="cbd5e0" w:sz="4"/>
+          <w:top w:val="single" w:color="5F2861" w:sz="12"/>
+          <w:bottom w:val="single" w:color="5F2861" w:sz="12"/>
+          <w:insideH w:val="single" w:color="D9D9D9" w:sz="4"/>
         </w:tblBorders>
       </w:tblPr>
       <w:tblGrid>
@@ -2047,7 +2047,7 @@
         <w:tc>
           <w:tcPr>
             <w:tcW w:w="3500" w:type="dxa"/>
-            <w:shd w:val="clear" w:fill="e8eef4"/>
+            <w:shd w:val="clear" w:fill="F2EEF2"/>
           </w:tcPr>
           <w:p>
             <w:pPr>
@@ -2067,7 +2067,7 @@
         <w:tc>
           <w:tcPr>
             <w:tcW w:w="6500" w:type="dxa"/>
-            <w:shd w:val="clear" w:fill="e8eef4"/>
+            <w:shd w:val="clear" w:fill="F2EEF2"/>
           </w:tcPr>
           <w:p>
             <w:pPr>
@@ -2097,7 +2097,7 @@
             </w:pPr>
             <w:r>
               <w:rPr>
-                <w:color w:val="4a5568"/>
+                <w:color w:val="404040"/>
                 <w:sz w:val="20"/>
               </w:rPr>
               <w:t>Tenant Root</w:t>
@@ -2115,7 +2115,7 @@
             </w:pPr>
             <w:r>
               <w:rPr>
-                <w:color w:val="4a5568"/>
+                <w:color w:val="404040"/>
                 <w:sz w:val="20"/>
               </w:rPr>
               <w:t>Top-level container for all management groups</w:t>
@@ -2135,7 +2135,7 @@
             </w:pPr>
             <w:r>
               <w:rPr>
-                <w:color w:val="4a5568"/>
+                <w:color w:val="404040"/>
                 <w:sz w:val="20"/>
               </w:rPr>
               <w:t>Platform</w:t>
@@ -2153,7 +2153,7 @@
             </w:pPr>
             <w:r>
               <w:rPr>
-                <w:color w:val="4a5568"/>
+                <w:color w:val="404040"/>
                 <w:sz w:val="20"/>
               </w:rPr>
               <w:t>Hosts shared platform services subscriptions</w:t>
@@ -2173,7 +2173,7 @@
             </w:pPr>
             <w:r>
               <w:rPr>
-                <w:color w:val="4a5568"/>
+                <w:color w:val="404040"/>
                 <w:sz w:val="20"/>
               </w:rPr>
               <w:t>  Identity</w:t>
@@ -2191,7 +2191,7 @@
             </w:pPr>
             <w:r>
               <w:rPr>
-                <w:color w:val="4a5568"/>
+                <w:color w:val="404040"/>
                 <w:sz w:val="20"/>
               </w:rPr>
               <w:t>Domain controllers, Entra DS, AD-related services</w:t>
@@ -2211,7 +2211,7 @@
             </w:pPr>
             <w:r>
               <w:rPr>
-                <w:color w:val="4a5568"/>
+                <w:color w:val="404040"/>
                 <w:sz w:val="20"/>
               </w:rPr>
               <w:t>  Connectivity</w:t>
@@ -2229,7 +2229,7 @@
             </w:pPr>
             <w:r>
               <w:rPr>
-                <w:color w:val="4a5568"/>
+                <w:color w:val="404040"/>
                 <w:sz w:val="20"/>
               </w:rPr>
               <w:t>Hub networks, gateways, firewall, DNS</w:t>
@@ -2249,7 +2249,7 @@
             </w:pPr>
             <w:r>
               <w:rPr>
-                <w:color w:val="4a5568"/>
+                <w:color w:val="404040"/>
                 <w:sz w:val="20"/>
               </w:rPr>
               <w:t>  Management</w:t>
@@ -2267,7 +2267,7 @@
             </w:pPr>
             <w:r>
               <w:rPr>
-                <w:color w:val="4a5568"/>
+                <w:color w:val="404040"/>
                 <w:sz w:val="20"/>
               </w:rPr>
               <w:t>Log Analytics, automation, monitoring</w:t>
@@ -2287,7 +2287,7 @@
             </w:pPr>
             <w:r>
               <w:rPr>
-                <w:color w:val="4a5568"/>
+                <w:color w:val="404040"/>
                 <w:sz w:val="20"/>
               </w:rPr>
               <w:t>  Security</w:t>
@@ -2305,7 +2305,7 @@
             </w:pPr>
             <w:r>
               <w:rPr>
-                <w:color w:val="4a5568"/>
+                <w:color w:val="404040"/>
                 <w:sz w:val="20"/>
               </w:rPr>
               <w:t>Microsoft Sentinel, security tooling (new in 2025)</w:t>
@@ -2325,7 +2325,7 @@
             </w:pPr>
             <w:r>
               <w:rPr>
-                <w:color w:val="4a5568"/>
+                <w:color w:val="404040"/>
                 <w:sz w:val="20"/>
               </w:rPr>
               <w:t>Landing Zones</w:t>
@@ -2343,7 +2343,7 @@
             </w:pPr>
             <w:r>
               <w:rPr>
-                <w:color w:val="4a5568"/>
+                <w:color w:val="404040"/>
                 <w:sz w:val="20"/>
               </w:rPr>
               <w:t>Hosts application workload subscriptions</w:t>
@@ -2363,7 +2363,7 @@
             </w:pPr>
             <w:r>
               <w:rPr>
-                <w:color w:val="4a5568"/>
+                <w:color w:val="404040"/>
                 <w:sz w:val="20"/>
               </w:rPr>
               <w:t>  Corp</w:t>
@@ -2381,7 +2381,7 @@
             </w:pPr>
             <w:r>
               <w:rPr>
-                <w:color w:val="4a5568"/>
+                <w:color w:val="404040"/>
                 <w:sz w:val="20"/>
               </w:rPr>
               <w:t>Internal/corporate workloads with hybrid connectivity</w:t>
@@ -2401,7 +2401,7 @@
             </w:pPr>
             <w:r>
               <w:rPr>
-                <w:color w:val="4a5568"/>
+                <w:color w:val="404040"/>
                 <w:sz w:val="20"/>
               </w:rPr>
               <w:t>  Online</w:t>
@@ -2419,7 +2419,7 @@
             </w:pPr>
             <w:r>
               <w:rPr>
-                <w:color w:val="4a5568"/>
+                <w:color w:val="404040"/>
                 <w:sz w:val="20"/>
               </w:rPr>
               <w:t>Internet-facing workloads</w:t>
@@ -2439,7 +2439,7 @@
             </w:pPr>
             <w:r>
               <w:rPr>
-                <w:color w:val="4a5568"/>
+                <w:color w:val="404040"/>
                 <w:sz w:val="20"/>
               </w:rPr>
               <w:t>Sandbox</w:t>
@@ -2457,7 +2457,7 @@
             </w:pPr>
             <w:r>
               <w:rPr>
-                <w:color w:val="4a5568"/>
+                <w:color w:val="404040"/>
                 <w:sz w:val="20"/>
               </w:rPr>
               <w:t>Experimental resources with no connectivity to production</w:t>
@@ -2477,7 +2477,7 @@
             </w:pPr>
             <w:r>
               <w:rPr>
-                <w:color w:val="4a5568"/>
+                <w:color w:val="404040"/>
                 <w:sz w:val="20"/>
               </w:rPr>
               <w:t>Decommissioned</w:t>
@@ -2495,7 +2495,7 @@
             </w:pPr>
             <w:r>
               <w:rPr>
-                <w:color w:val="4a5568"/>
+                <w:color w:val="404040"/>
                 <w:sz w:val="20"/>
               </w:rPr>
               <w:t>Retired subscriptions pending cleanup</w:t>
@@ -2592,9 +2592,9 @@
       <w:tblPr>
         <w:tblW w:w="5000" w:type="pct"/>
         <w:tblBorders>
-          <w:top w:val="single" w:color="1e3a5f" w:sz="12"/>
-          <w:bottom w:val="single" w:color="1e3a5f" w:sz="12"/>
-          <w:insideH w:val="single" w:color="cbd5e0" w:sz="4"/>
+          <w:top w:val="single" w:color="5F2861" w:sz="12"/>
+          <w:bottom w:val="single" w:color="5F2861" w:sz="12"/>
+          <w:insideH w:val="single" w:color="D9D9D9" w:sz="4"/>
         </w:tblBorders>
       </w:tblPr>
       <w:tblGrid>
@@ -2609,7 +2609,7 @@
         <w:tc>
           <w:tcPr>
             <w:tcW w:w="1400" w:type="dxa"/>
-            <w:shd w:val="clear" w:fill="e8eef4"/>
+            <w:shd w:val="clear" w:fill="F2EEF2"/>
           </w:tcPr>
           <w:p>
             <w:pPr>
@@ -2629,7 +2629,7 @@
         <w:tc>
           <w:tcPr>
             <w:tcW w:w="3600" w:type="dxa"/>
-            <w:shd w:val="clear" w:fill="e8eef4"/>
+            <w:shd w:val="clear" w:fill="F2EEF2"/>
           </w:tcPr>
           <w:p>
             <w:pPr>
@@ -2649,7 +2649,7 @@
         <w:tc>
           <w:tcPr>
             <w:tcW w:w="5000" w:type="dxa"/>
-            <w:shd w:val="clear" w:fill="e8eef4"/>
+            <w:shd w:val="clear" w:fill="F2EEF2"/>
           </w:tcPr>
           <w:p>
             <w:pPr>
@@ -2679,7 +2679,7 @@
             </w:pPr>
             <w:r>
               <w:rPr>
-                <w:color w:val="4a5568"/>
+                <w:color w:val="404040"/>
                 <w:sz w:val="20"/>
               </w:rPr>
               <w:t>CIS 3.3</w:t>
@@ -2697,7 +2697,7 @@
             </w:pPr>
             <w:r>
               <w:rPr>
-                <w:color w:val="4a5568"/>
+                <w:color w:val="404040"/>
                 <w:sz w:val="20"/>
               </w:rPr>
               <w:t>Configure Data Access Control Lists</w:t>
@@ -2715,7 +2715,7 @@
             </w:pPr>
             <w:r>
               <w:rPr>
-                <w:color w:val="4a5568"/>
+                <w:color w:val="404040"/>
                 <w:sz w:val="20"/>
               </w:rPr>
               <w:t>RBAC at management group scope; subscription-level access controls</w:t>
@@ -2735,7 +2735,7 @@
             </w:pPr>
             <w:r>
               <w:rPr>
-                <w:color w:val="4a5568"/>
+                <w:color w:val="404040"/>
                 <w:sz w:val="20"/>
               </w:rPr>
               <w:t>CIS 6.1</w:t>
@@ -2753,7 +2753,7 @@
             </w:pPr>
             <w:r>
               <w:rPr>
-                <w:color w:val="4a5568"/>
+                <w:color w:val="404040"/>
                 <w:sz w:val="20"/>
               </w:rPr>
               <w:t>Establish an Access Granting Process</w:t>
@@ -2771,7 +2771,7 @@
             </w:pPr>
             <w:r>
               <w:rPr>
-                <w:color w:val="4a5568"/>
+                <w:color w:val="404040"/>
                 <w:sz w:val="20"/>
               </w:rPr>
               <w:t>Subscription vending with automated RBAC assignment</w:t>
@@ -2791,7 +2791,7 @@
             </w:pPr>
             <w:r>
               <w:rPr>
-                <w:color w:val="4a5568"/>
+                <w:color w:val="404040"/>
                 <w:sz w:val="20"/>
               </w:rPr>
               <w:t>CIS 16.1</w:t>
@@ -2809,7 +2809,7 @@
             </w:pPr>
             <w:r>
               <w:rPr>
-                <w:color w:val="4a5568"/>
+                <w:color w:val="404040"/>
                 <w:sz w:val="20"/>
               </w:rPr>
               <w:t>Establish and Maintain Inventory of Assets</w:t>
@@ -2827,7 +2827,7 @@
             </w:pPr>
             <w:r>
               <w:rPr>
-                <w:color w:val="4a5568"/>
+                <w:color w:val="404040"/>
                 <w:sz w:val="20"/>
               </w:rPr>
               <w:t>Resource Graph + standardized tagging taxonomy</w:t>
@@ -2976,9 +2976,9 @@
       <w:tblPr>
         <w:tblW w:w="5000" w:type="pct"/>
         <w:tblBorders>
-          <w:top w:val="single" w:color="1e3a5f" w:sz="12"/>
-          <w:bottom w:val="single" w:color="1e3a5f" w:sz="12"/>
-          <w:insideH w:val="single" w:color="cbd5e0" w:sz="4"/>
+          <w:top w:val="single" w:color="5F2861" w:sz="12"/>
+          <w:bottom w:val="single" w:color="5F2861" w:sz="12"/>
+          <w:insideH w:val="single" w:color="D9D9D9" w:sz="4"/>
         </w:tblBorders>
       </w:tblPr>
       <w:tblGrid>
@@ -2993,7 +2993,7 @@
         <w:tc>
           <w:tcPr>
             <w:tcW w:w="1400" w:type="dxa"/>
-            <w:shd w:val="clear" w:fill="e8eef4"/>
+            <w:shd w:val="clear" w:fill="F2EEF2"/>
           </w:tcPr>
           <w:p>
             <w:pPr>
@@ -3013,7 +3013,7 @@
         <w:tc>
           <w:tcPr>
             <w:tcW w:w="3600" w:type="dxa"/>
-            <w:shd w:val="clear" w:fill="e8eef4"/>
+            <w:shd w:val="clear" w:fill="F2EEF2"/>
           </w:tcPr>
           <w:p>
             <w:pPr>
@@ -3033,7 +3033,7 @@
         <w:tc>
           <w:tcPr>
             <w:tcW w:w="5000" w:type="dxa"/>
-            <w:shd w:val="clear" w:fill="e8eef4"/>
+            <w:shd w:val="clear" w:fill="F2EEF2"/>
           </w:tcPr>
           <w:p>
             <w:pPr>
@@ -3063,7 +3063,7 @@
             </w:pPr>
             <w:r>
               <w:rPr>
-                <w:color w:val="4a5568"/>
+                <w:color w:val="404040"/>
                 <w:sz w:val="20"/>
               </w:rPr>
               <w:t>CIS 12.1</w:t>
@@ -3081,7 +3081,7 @@
             </w:pPr>
             <w:r>
               <w:rPr>
-                <w:color w:val="4a5568"/>
+                <w:color w:val="404040"/>
                 <w:sz w:val="20"/>
               </w:rPr>
               <w:t>Ensure Networks Are Segmented</w:t>
@@ -3099,7 +3099,7 @@
             </w:pPr>
             <w:r>
               <w:rPr>
-                <w:color w:val="4a5568"/>
+                <w:color w:val="404040"/>
                 <w:sz w:val="20"/>
               </w:rPr>
               <w:t>Hub-and-spoke/VWAN segmentation; VNet isolation</w:t>
@@ -3119,7 +3119,7 @@
             </w:pPr>
             <w:r>
               <w:rPr>
-                <w:color w:val="4a5568"/>
+                <w:color w:val="404040"/>
                 <w:sz w:val="20"/>
               </w:rPr>
               <w:t>CIS 12.2</w:t>
@@ -3137,7 +3137,7 @@
             </w:pPr>
             <w:r>
               <w:rPr>
-                <w:color w:val="4a5568"/>
+                <w:color w:val="404040"/>
                 <w:sz w:val="20"/>
               </w:rPr>
               <w:t>Implement Secure Access to Corporate Resources</w:t>
@@ -3155,7 +3155,7 @@
             </w:pPr>
             <w:r>
               <w:rPr>
-                <w:color w:val="4a5568"/>
+                <w:color w:val="404040"/>
                 <w:sz w:val="20"/>
               </w:rPr>
               <w:t>Private Link; ExpressRoute private peering</w:t>
@@ -3175,7 +3175,7 @@
             </w:pPr>
             <w:r>
               <w:rPr>
-                <w:color w:val="4a5568"/>
+                <w:color w:val="404040"/>
                 <w:sz w:val="20"/>
               </w:rPr>
               <w:t>CIS 12.4</w:t>
@@ -3193,7 +3193,7 @@
             </w:pPr>
             <w:r>
               <w:rPr>
-                <w:color w:val="4a5568"/>
+                <w:color w:val="404040"/>
                 <w:sz w:val="20"/>
               </w:rPr>
               <w:t>Implement Secure Access to Corporate Resources</w:t>
@@ -3211,7 +3211,7 @@
             </w:pPr>
             <w:r>
               <w:rPr>
-                <w:color w:val="4a5568"/>
+                <w:color w:val="404040"/>
                 <w:sz w:val="20"/>
               </w:rPr>
               <w:t>Azure Firewall; NSG rules; ASGs</w:t>
@@ -3231,7 +3231,7 @@
             </w:pPr>
             <w:r>
               <w:rPr>
-                <w:color w:val="4a5568"/>
+                <w:color w:val="404040"/>
                 <w:sz w:val="20"/>
               </w:rPr>
               <w:t>CIS 12.6</w:t>
@@ -3249,7 +3249,7 @@
             </w:pPr>
             <w:r>
               <w:rPr>
-                <w:color w:val="4a5568"/>
+                <w:color w:val="404040"/>
                 <w:sz w:val="20"/>
               </w:rPr>
               <w:t>Secure Access to Corporate Resources</w:t>
@@ -3267,7 +3267,7 @@
             </w:pPr>
             <w:r>
               <w:rPr>
-                <w:color w:val="4a5568"/>
+                <w:color w:val="404040"/>
                 <w:sz w:val="20"/>
               </w:rPr>
               <w:t>Network segmentation with security boundaries</w:t>
@@ -3287,7 +3287,7 @@
             </w:pPr>
             <w:r>
               <w:rPr>
-                <w:color w:val="4a5568"/>
+                <w:color w:val="404040"/>
                 <w:sz w:val="20"/>
               </w:rPr>
               <w:t>CIS 13.1</w:t>
@@ -3305,7 +3305,7 @@
             </w:pPr>
             <w:r>
               <w:rPr>
-                <w:color w:val="4a5568"/>
+                <w:color w:val="404040"/>
                 <w:sz w:val="20"/>
               </w:rPr>
               <w:t>Segment Traffic Flow</w:t>
@@ -3323,7 +3323,7 @@
             </w:pPr>
             <w:r>
               <w:rPr>
-                <w:color w:val="4a5568"/>
+                <w:color w:val="404040"/>
                 <w:sz w:val="20"/>
               </w:rPr>
               <w:t>Azure Firewall as traffic inspection choke point</w:t>
@@ -3343,7 +3343,7 @@
             </w:pPr>
             <w:r>
               <w:rPr>
-                <w:color w:val="4a5568"/>
+                <w:color w:val="404040"/>
                 <w:sz w:val="20"/>
               </w:rPr>
               <w:t>CIS 13.3</w:t>
@@ -3361,7 +3361,7 @@
             </w:pPr>
             <w:r>
               <w:rPr>
-                <w:color w:val="4a5568"/>
+                <w:color w:val="404040"/>
                 <w:sz w:val="20"/>
               </w:rPr>
               <w:t>Deploy DDoS Protection</w:t>
@@ -3379,7 +3379,7 @@
             </w:pPr>
             <w:r>
               <w:rPr>
-                <w:color w:val="4a5568"/>
+                <w:color w:val="404040"/>
                 <w:sz w:val="20"/>
               </w:rPr>
               <w:t>DDoS Protection Standard for public endpoints</w:t>
@@ -3569,9 +3569,9 @@
       <w:tblPr>
         <w:tblW w:w="5000" w:type="pct"/>
         <w:tblBorders>
-          <w:top w:val="single" w:color="1e3a5f" w:sz="12"/>
-          <w:bottom w:val="single" w:color="1e3a5f" w:sz="12"/>
-          <w:insideH w:val="single" w:color="cbd5e0" w:sz="4"/>
+          <w:top w:val="single" w:color="5F2861" w:sz="12"/>
+          <w:bottom w:val="single" w:color="5F2861" w:sz="12"/>
+          <w:insideH w:val="single" w:color="D9D9D9" w:sz="4"/>
         </w:tblBorders>
       </w:tblPr>
       <w:tblGrid>
@@ -3586,7 +3586,7 @@
         <w:tc>
           <w:tcPr>
             <w:tcW w:w="1400" w:type="dxa"/>
-            <w:shd w:val="clear" w:fill="e8eef4"/>
+            <w:shd w:val="clear" w:fill="F2EEF2"/>
           </w:tcPr>
           <w:p>
             <w:pPr>
@@ -3606,7 +3606,7 @@
         <w:tc>
           <w:tcPr>
             <w:tcW w:w="3600" w:type="dxa"/>
-            <w:shd w:val="clear" w:fill="e8eef4"/>
+            <w:shd w:val="clear" w:fill="F2EEF2"/>
           </w:tcPr>
           <w:p>
             <w:pPr>
@@ -3626,7 +3626,7 @@
         <w:tc>
           <w:tcPr>
             <w:tcW w:w="5000" w:type="dxa"/>
-            <w:shd w:val="clear" w:fill="e8eef4"/>
+            <w:shd w:val="clear" w:fill="F2EEF2"/>
           </w:tcPr>
           <w:p>
             <w:pPr>
@@ -3656,7 +3656,7 @@
             </w:pPr>
             <w:r>
               <w:rPr>
-                <w:color w:val="4a5568"/>
+                <w:color w:val="404040"/>
                 <w:sz w:val="20"/>
               </w:rPr>
               <w:t>CIS 8.2</w:t>
@@ -3674,7 +3674,7 @@
             </w:pPr>
             <w:r>
               <w:rPr>
-                <w:color w:val="4a5568"/>
+                <w:color w:val="404040"/>
                 <w:sz w:val="20"/>
               </w:rPr>
               <w:t>Collect Audit Logs</w:t>
@@ -3692,7 +3692,7 @@
             </w:pPr>
             <w:r>
               <w:rPr>
-                <w:color w:val="4a5568"/>
+                <w:color w:val="404040"/>
                 <w:sz w:val="20"/>
               </w:rPr>
               <w:t>Azure Monitor; Log Analytics; diagnostic settings</w:t>
@@ -3712,7 +3712,7 @@
             </w:pPr>
             <w:r>
               <w:rPr>
-                <w:color w:val="4a5568"/>
+                <w:color w:val="404040"/>
                 <w:sz w:val="20"/>
               </w:rPr>
               <w:t>CIS 8.5</w:t>
@@ -3730,7 +3730,7 @@
             </w:pPr>
             <w:r>
               <w:rPr>
-                <w:color w:val="4a5568"/>
+                <w:color w:val="404040"/>
                 <w:sz w:val="20"/>
               </w:rPr>
               <w:t>Deploy Anti-Malware</w:t>
@@ -3748,7 +3748,7 @@
             </w:pPr>
             <w:r>
               <w:rPr>
-                <w:color w:val="4a5568"/>
+                <w:color w:val="404040"/>
                 <w:sz w:val="20"/>
               </w:rPr>
               <w:t>Defender for Cloud; Defender for Storage antivirus</w:t>
@@ -3768,7 +3768,7 @@
             </w:pPr>
             <w:r>
               <w:rPr>
-                <w:color w:val="4a5568"/>
+                <w:color w:val="404040"/>
                 <w:sz w:val="20"/>
               </w:rPr>
               <w:t>CIS 10.1</w:t>
@@ -3786,7 +3786,7 @@
             </w:pPr>
             <w:r>
               <w:rPr>
-                <w:color w:val="4a5568"/>
+                <w:color w:val="404040"/>
                 <w:sz w:val="20"/>
               </w:rPr>
               <w:t>Deploy Anti-Malware</w:t>
@@ -3804,7 +3804,7 @@
             </w:pPr>
             <w:r>
               <w:rPr>
-                <w:color w:val="4a5568"/>
+                <w:color w:val="404040"/>
                 <w:sz w:val="20"/>
               </w:rPr>
               <w:t>Defender for Servers anti-malware</w:t>
@@ -3824,7 +3824,7 @@
             </w:pPr>
             <w:r>
               <w:rPr>
-                <w:color w:val="4a5568"/>
+                <w:color w:val="404040"/>
                 <w:sz w:val="20"/>
               </w:rPr>
               <w:t>CIS 13.2</w:t>
@@ -3842,7 +3842,7 @@
             </w:pPr>
             <w:r>
               <w:rPr>
-                <w:color w:val="4a5568"/>
+                <w:color w:val="404040"/>
                 <w:sz w:val="20"/>
               </w:rPr>
               <w:t>Deploy Intrusion Detection</w:t>
@@ -3860,7 +3860,7 @@
             </w:pPr>
             <w:r>
               <w:rPr>
-                <w:color w:val="4a5568"/>
+                <w:color w:val="404040"/>
                 <w:sz w:val="20"/>
               </w:rPr>
               <w:t>Microsoft Sentinel; Defender for Cloud alerts</w:t>
@@ -3880,7 +3880,7 @@
             </w:pPr>
             <w:r>
               <w:rPr>
-                <w:color w:val="4a5568"/>
+                <w:color w:val="404040"/>
                 <w:sz w:val="20"/>
               </w:rPr>
               <w:t>CIS 16.9</w:t>
@@ -3898,7 +3898,7 @@
             </w:pPr>
             <w:r>
               <w:rPr>
-                <w:color w:val="4a5568"/>
+                <w:color w:val="404040"/>
                 <w:sz w:val="20"/>
               </w:rPr>
               <w:t>Encrypt Data at Rest</w:t>
@@ -3916,7 +3916,7 @@
             </w:pPr>
             <w:r>
               <w:rPr>
-                <w:color w:val="4a5568"/>
+                <w:color w:val="404040"/>
                 <w:sz w:val="20"/>
               </w:rPr>
               <w:t>Key Vault for encryption keys; storage encryption</w:t>
@@ -3936,7 +3936,7 @@
             </w:pPr>
             <w:r>
               <w:rPr>
-                <w:color w:val="4a5568"/>
+                <w:color w:val="404040"/>
                 <w:sz w:val="20"/>
               </w:rPr>
               <w:t>CIS 16.12</w:t>
@@ -3954,7 +3954,7 @@
             </w:pPr>
             <w:r>
               <w:rPr>
-                <w:color w:val="4a5568"/>
+                <w:color w:val="404040"/>
                 <w:sz w:val="20"/>
               </w:rPr>
               <w:t>Encrypt Data at Rest</w:t>
@@ -3972,7 +3972,7 @@
             </w:pPr>
             <w:r>
               <w:rPr>
-                <w:color w:val="4a5568"/>
+                <w:color w:val="404040"/>
                 <w:sz w:val="20"/>
               </w:rPr>
               <w:t>Platform-managed and customer-managed keys</w:t>
@@ -4111,9 +4111,9 @@
       <w:tblPr>
         <w:tblW w:w="5000" w:type="pct"/>
         <w:tblBorders>
-          <w:top w:val="single" w:color="1e3a5f" w:sz="12"/>
-          <w:bottom w:val="single" w:color="1e3a5f" w:sz="12"/>
-          <w:insideH w:val="single" w:color="cbd5e0" w:sz="4"/>
+          <w:top w:val="single" w:color="5F2861" w:sz="12"/>
+          <w:bottom w:val="single" w:color="5F2861" w:sz="12"/>
+          <w:insideH w:val="single" w:color="D9D9D9" w:sz="4"/>
         </w:tblBorders>
       </w:tblPr>
       <w:tblGrid>
@@ -4128,7 +4128,7 @@
         <w:tc>
           <w:tcPr>
             <w:tcW w:w="1400" w:type="dxa"/>
-            <w:shd w:val="clear" w:fill="e8eef4"/>
+            <w:shd w:val="clear" w:fill="F2EEF2"/>
           </w:tcPr>
           <w:p>
             <w:pPr>
@@ -4148,7 +4148,7 @@
         <w:tc>
           <w:tcPr>
             <w:tcW w:w="3600" w:type="dxa"/>
-            <w:shd w:val="clear" w:fill="e8eef4"/>
+            <w:shd w:val="clear" w:fill="F2EEF2"/>
           </w:tcPr>
           <w:p>
             <w:pPr>
@@ -4168,7 +4168,7 @@
         <w:tc>
           <w:tcPr>
             <w:tcW w:w="5000" w:type="dxa"/>
-            <w:shd w:val="clear" w:fill="e8eef4"/>
+            <w:shd w:val="clear" w:fill="F2EEF2"/>
           </w:tcPr>
           <w:p>
             <w:pPr>
@@ -4198,7 +4198,7 @@
             </w:pPr>
             <w:r>
               <w:rPr>
-                <w:color w:val="4a5568"/>
+                <w:color w:val="404040"/>
                 <w:sz w:val="20"/>
               </w:rPr>
               <w:t>CIS 8.2</w:t>
@@ -4216,7 +4216,7 @@
             </w:pPr>
             <w:r>
               <w:rPr>
-                <w:color w:val="4a5568"/>
+                <w:color w:val="404040"/>
                 <w:sz w:val="20"/>
               </w:rPr>
               <w:t>Collect Audit Logs</w:t>
@@ -4234,7 +4234,7 @@
             </w:pPr>
             <w:r>
               <w:rPr>
-                <w:color w:val="4a5568"/>
+                <w:color w:val="404040"/>
                 <w:sz w:val="20"/>
               </w:rPr>
               <w:t>Azure Monitor; Log Analytics; diagnostic settings</w:t>
@@ -4254,7 +4254,7 @@
             </w:pPr>
             <w:r>
               <w:rPr>
-                <w:color w:val="4a5568"/>
+                <w:color w:val="404040"/>
                 <w:sz w:val="20"/>
               </w:rPr>
               <w:t>CIS 8.11</w:t>
@@ -4272,7 +4272,7 @@
             </w:pPr>
             <w:r>
               <w:rPr>
-                <w:color w:val="4a5568"/>
+                <w:color w:val="404040"/>
                 <w:sz w:val="20"/>
               </w:rPr>
               <w:t>Collect Audit Logs</w:t>
@@ -4290,7 +4290,7 @@
             </w:pPr>
             <w:r>
               <w:rPr>
-                <w:color w:val="4a5568"/>
+                <w:color w:val="404040"/>
                 <w:sz w:val="20"/>
               </w:rPr>
               <w:t>Centralized audit log collection to Log Analytics</w:t>
@@ -4310,7 +4310,7 @@
             </w:pPr>
             <w:r>
               <w:rPr>
-                <w:color w:val="4a5568"/>
+                <w:color w:val="404040"/>
                 <w:sz w:val="20"/>
               </w:rPr>
               <w:t>CIS 11.1</w:t>
@@ -4328,7 +4328,7 @@
             </w:pPr>
             <w:r>
               <w:rPr>
-                <w:color w:val="4a5568"/>
+                <w:color w:val="404040"/>
                 <w:sz w:val="20"/>
               </w:rPr>
               <w:t>Ensure Regular Automated Backups</w:t>
@@ -4346,7 +4346,7 @@
             </w:pPr>
             <w:r>
               <w:rPr>
-                <w:color w:val="4a5568"/>
+                <w:color w:val="404040"/>
                 <w:sz w:val="20"/>
               </w:rPr>
               <w:t>Azure Backup; backup policies at scope</w:t>
@@ -4366,7 +4366,7 @@
             </w:pPr>
             <w:r>
               <w:rPr>
-                <w:color w:val="4a5568"/>
+                <w:color w:val="404040"/>
                 <w:sz w:val="20"/>
               </w:rPr>
               <w:t>CIS 11.2</w:t>
@@ -4384,7 +4384,7 @@
             </w:pPr>
             <w:r>
               <w:rPr>
-                <w:color w:val="4a5568"/>
+                <w:color w:val="404040"/>
                 <w:sz w:val="20"/>
               </w:rPr>
               <w:t>Perform Complete System Backups</w:t>
@@ -4402,7 +4402,7 @@
             </w:pPr>
             <w:r>
               <w:rPr>
-                <w:color w:val="4a5568"/>
+                <w:color w:val="404040"/>
                 <w:sz w:val="20"/>
               </w:rPr>
               <w:t>Workload backup via Azure Backup service</w:t>
@@ -4422,7 +4422,7 @@
             </w:pPr>
             <w:r>
               <w:rPr>
-                <w:color w:val="4a5568"/>
+                <w:color w:val="404040"/>
                 <w:sz w:val="20"/>
               </w:rPr>
               <w:t>CIS 11.3</w:t>
@@ -4440,7 +4440,7 @@
             </w:pPr>
             <w:r>
               <w:rPr>
-                <w:color w:val="4a5568"/>
+                <w:color w:val="404040"/>
                 <w:sz w:val="20"/>
               </w:rPr>
               <w:t>Protect Backups</w:t>
@@ -4458,7 +4458,7 @@
             </w:pPr>
             <w:r>
               <w:rPr>
-                <w:color w:val="4a5568"/>
+                <w:color w:val="404040"/>
                 <w:sz w:val="20"/>
               </w:rPr>
               <w:t>Backup encryption; geo-redundant storage</w:t>
@@ -4630,9 +4630,9 @@
       <w:tblPr>
         <w:tblW w:w="5000" w:type="pct"/>
         <w:tblBorders>
-          <w:top w:val="single" w:color="1e3a5f" w:sz="12"/>
-          <w:bottom w:val="single" w:color="1e3a5f" w:sz="12"/>
-          <w:insideH w:val="single" w:color="cbd5e0" w:sz="4"/>
+          <w:top w:val="single" w:color="5F2861" w:sz="12"/>
+          <w:bottom w:val="single" w:color="5F2861" w:sz="12"/>
+          <w:insideH w:val="single" w:color="D9D9D9" w:sz="4"/>
         </w:tblBorders>
       </w:tblPr>
       <w:tblGrid>
@@ -4647,7 +4647,7 @@
         <w:tc>
           <w:tcPr>
             <w:tcW w:w="1400" w:type="dxa"/>
-            <w:shd w:val="clear" w:fill="e8eef4"/>
+            <w:shd w:val="clear" w:fill="F2EEF2"/>
           </w:tcPr>
           <w:p>
             <w:pPr>
@@ -4667,7 +4667,7 @@
         <w:tc>
           <w:tcPr>
             <w:tcW w:w="3600" w:type="dxa"/>
-            <w:shd w:val="clear" w:fill="e8eef4"/>
+            <w:shd w:val="clear" w:fill="F2EEF2"/>
           </w:tcPr>
           <w:p>
             <w:pPr>
@@ -4687,7 +4687,7 @@
         <w:tc>
           <w:tcPr>
             <w:tcW w:w="5000" w:type="dxa"/>
-            <w:shd w:val="clear" w:fill="e8eef4"/>
+            <w:shd w:val="clear" w:fill="F2EEF2"/>
           </w:tcPr>
           <w:p>
             <w:pPr>
@@ -4717,7 +4717,7 @@
             </w:pPr>
             <w:r>
               <w:rPr>
-                <w:color w:val="4a5568"/>
+                <w:color w:val="404040"/>
                 <w:sz w:val="20"/>
               </w:rPr>
               <w:t>CIS 4.1</w:t>
@@ -4735,7 +4735,7 @@
             </w:pPr>
             <w:r>
               <w:rPr>
-                <w:color w:val="4a5568"/>
+                <w:color w:val="404040"/>
                 <w:sz w:val="20"/>
               </w:rPr>
               <w:t>Establish and Maintain a Secure Configuration Process</w:t>
@@ -4753,7 +4753,7 @@
             </w:pPr>
             <w:r>
               <w:rPr>
-                <w:color w:val="4a5568"/>
+                <w:color w:val="404040"/>
                 <w:sz w:val="20"/>
               </w:rPr>
               <w:t>Azure Policy for secure configuration baselines</w:t>
@@ -4773,7 +4773,7 @@
             </w:pPr>
             <w:r>
               <w:rPr>
-                <w:color w:val="4a5568"/>
+                <w:color w:val="404040"/>
                 <w:sz w:val="20"/>
               </w:rPr>
               <w:t>CIS 4.2</w:t>
@@ -4791,7 +4791,7 @@
             </w:pPr>
             <w:r>
               <w:rPr>
-                <w:color w:val="4a5568"/>
+                <w:color w:val="404040"/>
                 <w:sz w:val="20"/>
               </w:rPr>
               <w:t>Establish and Maintain a Secure Configuration Process</w:t>
@@ -4809,7 +4809,7 @@
             </w:pPr>
             <w:r>
               <w:rPr>
-                <w:color w:val="4a5568"/>
+                <w:color w:val="404040"/>
                 <w:sz w:val="20"/>
               </w:rPr>
               <w:t>Policy initiatives for configuration enforcement</w:t>
@@ -4829,7 +4829,7 @@
             </w:pPr>
             <w:r>
               <w:rPr>
-                <w:color w:val="4a5568"/>
+                <w:color w:val="404040"/>
                 <w:sz w:val="20"/>
               </w:rPr>
               <w:t>CIS 4.7</w:t>
@@ -4847,7 +4847,7 @@
             </w:pPr>
             <w:r>
               <w:rPr>
-                <w:color w:val="4a5568"/>
+                <w:color w:val="404040"/>
                 <w:sz w:val="20"/>
               </w:rPr>
               <w:t>Manage Default Accounts on Enterprise Assets</w:t>
@@ -4865,7 +4865,7 @@
             </w:pPr>
             <w:r>
               <w:rPr>
-                <w:color w:val="4a5568"/>
+                <w:color w:val="404040"/>
                 <w:sz w:val="20"/>
               </w:rPr>
               <w:t>Policy to manage default accounts and credentials</w:t>
@@ -4885,7 +4885,7 @@
             </w:pPr>
             <w:r>
               <w:rPr>
-                <w:color w:val="4a5568"/>
+                <w:color w:val="404040"/>
                 <w:sz w:val="20"/>
               </w:rPr>
               <w:t>CIS 4.8</w:t>
@@ -4903,7 +4903,7 @@
             </w:pPr>
             <w:r>
               <w:rPr>
-                <w:color w:val="4a5568"/>
+                <w:color w:val="404040"/>
                 <w:sz w:val="20"/>
               </w:rPr>
               <w:t>Uninstall or Disable Unnecessary Services</w:t>
@@ -4921,7 +4921,7 @@
             </w:pPr>
             <w:r>
               <w:rPr>
-                <w:color w:val="4a5568"/>
+                <w:color w:val="404040"/>
                 <w:sz w:val="20"/>
               </w:rPr>
               <w:t>Policy to detect and disable unnecessary services</w:t>
@@ -5083,9 +5083,9 @@
       <w:tblPr>
         <w:tblW w:w="5000" w:type="pct"/>
         <w:tblBorders>
-          <w:top w:val="single" w:color="1e3a5f" w:sz="12"/>
-          <w:bottom w:val="single" w:color="1e3a5f" w:sz="12"/>
-          <w:insideH w:val="single" w:color="cbd5e0" w:sz="4"/>
+          <w:top w:val="single" w:color="5F2861" w:sz="12"/>
+          <w:bottom w:val="single" w:color="5F2861" w:sz="12"/>
+          <w:insideH w:val="single" w:color="D9D9D9" w:sz="4"/>
         </w:tblBorders>
       </w:tblPr>
       <w:tblGrid>
@@ -5100,7 +5100,7 @@
         <w:tc>
           <w:tcPr>
             <w:tcW w:w="1400" w:type="dxa"/>
-            <w:shd w:val="clear" w:fill="e8eef4"/>
+            <w:shd w:val="clear" w:fill="F2EEF2"/>
           </w:tcPr>
           <w:p>
             <w:pPr>
@@ -5120,7 +5120,7 @@
         <w:tc>
           <w:tcPr>
             <w:tcW w:w="3600" w:type="dxa"/>
-            <w:shd w:val="clear" w:fill="e8eef4"/>
+            <w:shd w:val="clear" w:fill="F2EEF2"/>
           </w:tcPr>
           <w:p>
             <w:pPr>
@@ -5140,7 +5140,7 @@
         <w:tc>
           <w:tcPr>
             <w:tcW w:w="5000" w:type="dxa"/>
-            <w:shd w:val="clear" w:fill="e8eef4"/>
+            <w:shd w:val="clear" w:fill="F2EEF2"/>
           </w:tcPr>
           <w:p>
             <w:pPr>
@@ -5170,7 +5170,7 @@
             </w:pPr>
             <w:r>
               <w:rPr>
-                <w:color w:val="4a5568"/>
+                <w:color w:val="404040"/>
                 <w:sz w:val="20"/>
               </w:rPr>
               <w:t>CIS 4.1</w:t>
@@ -5188,7 +5188,7 @@
             </w:pPr>
             <w:r>
               <w:rPr>
-                <w:color w:val="4a5568"/>
+                <w:color w:val="404040"/>
                 <w:sz w:val="20"/>
               </w:rPr>
               <w:t>Establish Secure Configuration Process</w:t>
@@ -5206,7 +5206,7 @@
             </w:pPr>
             <w:r>
               <w:rPr>
-                <w:color w:val="4a5568"/>
+                <w:color w:val="404040"/>
                 <w:sz w:val="20"/>
               </w:rPr>
               <w:t>IaC for consistent secure configurations</w:t>
@@ -5226,7 +5226,7 @@
             </w:pPr>
             <w:r>
               <w:rPr>
-                <w:color w:val="4a5568"/>
+                <w:color w:val="404040"/>
                 <w:sz w:val="20"/>
               </w:rPr>
               <w:t>CIS 6.1</w:t>
@@ -5244,7 +5244,7 @@
             </w:pPr>
             <w:r>
               <w:rPr>
-                <w:color w:val="4a5568"/>
+                <w:color w:val="404040"/>
                 <w:sz w:val="20"/>
               </w:rPr>
               <w:t>Establish an Access Granting Process</w:t>
@@ -5262,7 +5262,7 @@
             </w:pPr>
             <w:r>
               <w:rPr>
-                <w:color w:val="4a5568"/>
+                <w:color w:val="404040"/>
                 <w:sz w:val="20"/>
               </w:rPr>
               <w:t>Pipeline-based access with Workload Identity Federation</w:t>
@@ -5282,7 +5282,7 @@
             </w:pPr>
             <w:r>
               <w:rPr>
-                <w:color w:val="4a5568"/>
+                <w:color w:val="404040"/>
                 <w:sz w:val="20"/>
               </w:rPr>
               <w:t>CIS 6.5</w:t>
@@ -5300,7 +5300,7 @@
             </w:pPr>
             <w:r>
               <w:rPr>
-                <w:color w:val="4a5568"/>
+                <w:color w:val="404040"/>
                 <w:sz w:val="20"/>
               </w:rPr>
               <w:t>Require MFA for Administrative Access</w:t>
@@ -5318,7 +5318,7 @@
             </w:pPr>
             <w:r>
               <w:rPr>
-                <w:color w:val="4a5568"/>
+                <w:color w:val="404040"/>
                 <w:sz w:val="20"/>
               </w:rPr>
               <w:t>MFA for all pipeline administrative access</w:t>
@@ -5338,7 +5338,7 @@
             </w:pPr>
             <w:r>
               <w:rPr>
-                <w:color w:val="4a5568"/>
+                <w:color w:val="404040"/>
                 <w:sz w:val="20"/>
               </w:rPr>
               <w:t>CIS 7.3</w:t>
@@ -5356,7 +5356,7 @@
             </w:pPr>
             <w:r>
               <w:rPr>
-                <w:color w:val="4a5568"/>
+                <w:color w:val="404040"/>
                 <w:sz w:val="20"/>
               </w:rPr>
               <w:t>Perform Automated Operating System Patch Management</w:t>
@@ -5374,7 +5374,7 @@
             </w:pPr>
             <w:r>
               <w:rPr>
-                <w:color w:val="4a5568"/>
+                <w:color w:val="404040"/>
                 <w:sz w:val="20"/>
               </w:rPr>
               <w:t>Automated updates through CI/CD pipelines</w:t>
@@ -5394,7 +5394,7 @@
             </w:pPr>
             <w:r>
               <w:rPr>
-                <w:color w:val="4a5568"/>
+                <w:color w:val="404040"/>
                 <w:sz w:val="20"/>
               </w:rPr>
               <w:t>CIS 7.4</w:t>
@@ -5412,7 +5412,7 @@
             </w:pPr>
             <w:r>
               <w:rPr>
-                <w:color w:val="4a5568"/>
+                <w:color w:val="404040"/>
                 <w:sz w:val="20"/>
               </w:rPr>
               <w:t>Perform Automated Application Patch Management</w:t>
@@ -5430,7 +5430,7 @@
             </w:pPr>
             <w:r>
               <w:rPr>
-                <w:color w:val="4a5568"/>
+                <w:color w:val="404040"/>
                 <w:sz w:val="20"/>
               </w:rPr>
               <w:t>Automated patching through Azure Update Manager</w:t>
@@ -5517,9 +5517,9 @@
       <w:tblPr>
         <w:tblW w:w="5000" w:type="pct"/>
         <w:tblBorders>
-          <w:top w:val="single" w:color="1e3a5f" w:sz="12"/>
-          <w:bottom w:val="single" w:color="1e3a5f" w:sz="12"/>
-          <w:insideH w:val="single" w:color="cbd5e0" w:sz="4"/>
+          <w:top w:val="single" w:color="5F2861" w:sz="12"/>
+          <w:bottom w:val="single" w:color="5F2861" w:sz="12"/>
+          <w:insideH w:val="single" w:color="D9D9D9" w:sz="4"/>
         </w:tblBorders>
       </w:tblPr>
       <w:tblGrid>
@@ -5534,7 +5534,7 @@
         <w:tc>
           <w:tcPr>
             <w:tcW w:w="1200" w:type="dxa"/>
-            <w:shd w:val="clear" w:fill="e8eef4"/>
+            <w:shd w:val="clear" w:fill="F2EEF2"/>
           </w:tcPr>
           <w:p>
             <w:pPr>
@@ -5554,7 +5554,7 @@
         <w:tc>
           <w:tcPr>
             <w:tcW w:w="2800" w:type="dxa"/>
-            <w:shd w:val="clear" w:fill="e8eef4"/>
+            <w:shd w:val="clear" w:fill="F2EEF2"/>
           </w:tcPr>
           <w:p>
             <w:pPr>
@@ -5574,7 +5574,7 @@
         <w:tc>
           <w:tcPr>
             <w:tcW w:w="6000" w:type="dxa"/>
-            <w:shd w:val="clear" w:fill="e8eef4"/>
+            <w:shd w:val="clear" w:fill="F2EEF2"/>
           </w:tcPr>
           <w:p>
             <w:pPr>
@@ -5604,7 +5604,7 @@
             </w:pPr>
             <w:r>
               <w:rPr>
-                <w:color w:val="4a5568"/>
+                <w:color w:val="404040"/>
                 <w:sz w:val="20"/>
               </w:rPr>
               <w:t>NS-1</w:t>
@@ -5622,7 +5622,7 @@
             </w:pPr>
             <w:r>
               <w:rPr>
-                <w:color w:val="4a5568"/>
+                <w:color w:val="404040"/>
                 <w:sz w:val="20"/>
               </w:rPr>
               <w:t>Network Segmentation</w:t>
@@ -5640,7 +5640,7 @@
             </w:pPr>
             <w:r>
               <w:rPr>
-                <w:color w:val="4a5568"/>
+                <w:color w:val="404040"/>
                 <w:sz w:val="20"/>
               </w:rPr>
               <w:t>Hub-and-spoke or vWAN; NSGs; ASGs; Azure Firewall</w:t>
@@ -5660,7 +5660,7 @@
             </w:pPr>
             <w:r>
               <w:rPr>
-                <w:color w:val="4a5568"/>
+                <w:color w:val="404040"/>
                 <w:sz w:val="20"/>
               </w:rPr>
               <w:t>NS-2</w:t>
@@ -5678,7 +5678,7 @@
             </w:pPr>
             <w:r>
               <w:rPr>
-                <w:color w:val="4a5568"/>
+                <w:color w:val="404040"/>
                 <w:sz w:val="20"/>
               </w:rPr>
               <w:t>Secure Cloud Services</w:t>
@@ -5696,7 +5696,7 @@
             </w:pPr>
             <w:r>
               <w:rPr>
-                <w:color w:val="4a5568"/>
+                <w:color w:val="404040"/>
                 <w:sz w:val="20"/>
               </w:rPr>
               <w:t>Private Link; service endpoints; network restrictions</w:t>
@@ -5716,7 +5716,7 @@
             </w:pPr>
             <w:r>
               <w:rPr>
-                <w:color w:val="4a5568"/>
+                <w:color w:val="404040"/>
                 <w:sz w:val="20"/>
               </w:rPr>
               <w:t>NS-3</w:t>
@@ -5734,7 +5734,7 @@
             </w:pPr>
             <w:r>
               <w:rPr>
-                <w:color w:val="4a5568"/>
+                <w:color w:val="404040"/>
                 <w:sz w:val="20"/>
               </w:rPr>
               <w:t>Edge Firewall</w:t>
@@ -5752,7 +5752,7 @@
             </w:pPr>
             <w:r>
               <w:rPr>
-                <w:color w:val="4a5568"/>
+                <w:color w:val="404040"/>
                 <w:sz w:val="20"/>
               </w:rPr>
               <w:t>Azure Firewall Premium; firewall policies at hub</w:t>
@@ -5772,7 +5772,7 @@
             </w:pPr>
             <w:r>
               <w:rPr>
-                <w:color w:val="4a5568"/>
+                <w:color w:val="404040"/>
                 <w:sz w:val="20"/>
               </w:rPr>
               <w:t>NS-4</w:t>
@@ -5790,7 +5790,7 @@
             </w:pPr>
             <w:r>
               <w:rPr>
-                <w:color w:val="4a5568"/>
+                <w:color w:val="404040"/>
                 <w:sz w:val="20"/>
               </w:rPr>
               <w:t>IDS/IPS</w:t>
@@ -5808,7 +5808,7 @@
             </w:pPr>
             <w:r>
               <w:rPr>
-                <w:color w:val="4a5568"/>
+                <w:color w:val="404040"/>
                 <w:sz w:val="20"/>
               </w:rPr>
               <w:t>Microsoft Sentinel; Defender for Cloud threat detection</w:t>
@@ -5828,7 +5828,7 @@
             </w:pPr>
             <w:r>
               <w:rPr>
-                <w:color w:val="4a5568"/>
+                <w:color w:val="404040"/>
                 <w:sz w:val="20"/>
               </w:rPr>
               <w:t>NS-5</w:t>
@@ -5846,7 +5846,7 @@
             </w:pPr>
             <w:r>
               <w:rPr>
-                <w:color w:val="4a5568"/>
+                <w:color w:val="404040"/>
                 <w:sz w:val="20"/>
               </w:rPr>
               <w:t>DDoS Protection</w:t>
@@ -5864,7 +5864,7 @@
             </w:pPr>
             <w:r>
               <w:rPr>
-                <w:color w:val="4a5568"/>
+                <w:color w:val="404040"/>
                 <w:sz w:val="20"/>
               </w:rPr>
               <w:t>DDoS Protection Standard for public endpoints</w:t>
@@ -5884,7 +5884,7 @@
             </w:pPr>
             <w:r>
               <w:rPr>
-                <w:color w:val="4a5568"/>
+                <w:color w:val="404040"/>
                 <w:sz w:val="20"/>
               </w:rPr>
               <w:t>NS-6</w:t>
@@ -5902,7 +5902,7 @@
             </w:pPr>
             <w:r>
               <w:rPr>
-                <w:color w:val="4a5568"/>
+                <w:color w:val="404040"/>
                 <w:sz w:val="20"/>
               </w:rPr>
               <w:t>Web Application Firewall</w:t>
@@ -5920,7 +5920,7 @@
             </w:pPr>
             <w:r>
               <w:rPr>
-                <w:color w:val="4a5568"/>
+                <w:color w:val="404040"/>
                 <w:sz w:val="20"/>
               </w:rPr>
               <w:t>Azure WAF on Application Gateway; managed rules</w:t>
@@ -5940,7 +5940,7 @@
             </w:pPr>
             <w:r>
               <w:rPr>
-                <w:color w:val="4a5568"/>
+                <w:color w:val="404040"/>
                 <w:sz w:val="20"/>
               </w:rPr>
               <w:t>NS-7</w:t>
@@ -5958,7 +5958,7 @@
             </w:pPr>
             <w:r>
               <w:rPr>
-                <w:color w:val="4a5568"/>
+                <w:color w:val="404040"/>
                 <w:sz w:val="20"/>
               </w:rPr>
               <w:t>Central Network Security</w:t>
@@ -5976,7 +5976,7 @@
             </w:pPr>
             <w:r>
               <w:rPr>
-                <w:color w:val="4a5568"/>
+                <w:color w:val="404040"/>
                 <w:sz w:val="20"/>
               </w:rPr>
               <w:t>Azure Firewall Manager; centralized NSG management</w:t>
@@ -5996,7 +5996,7 @@
             </w:pPr>
             <w:r>
               <w:rPr>
-                <w:color w:val="4a5568"/>
+                <w:color w:val="404040"/>
                 <w:sz w:val="20"/>
               </w:rPr>
               <w:t>NS-8</w:t>
@@ -6014,7 +6014,7 @@
             </w:pPr>
             <w:r>
               <w:rPr>
-                <w:color w:val="4a5568"/>
+                <w:color w:val="404040"/>
                 <w:sz w:val="20"/>
               </w:rPr>
               <w:t>Disable Insecure Services</w:t>
@@ -6032,7 +6032,7 @@
             </w:pPr>
             <w:r>
               <w:rPr>
-                <w:color w:val="4a5568"/>
+                <w:color w:val="404040"/>
                 <w:sz w:val="20"/>
               </w:rPr>
               <w:t>Azure Policy to block insecure protocols</w:t>
@@ -6052,7 +6052,7 @@
             </w:pPr>
             <w:r>
               <w:rPr>
-                <w:color w:val="4a5568"/>
+                <w:color w:val="404040"/>
                 <w:sz w:val="20"/>
               </w:rPr>
               <w:t>IM-1</w:t>
@@ -6070,7 +6070,7 @@
             </w:pPr>
             <w:r>
               <w:rPr>
-                <w:color w:val="4a5568"/>
+                <w:color w:val="404040"/>
                 <w:sz w:val="20"/>
               </w:rPr>
               <w:t>Centralize Identity</w:t>
@@ -6088,7 +6088,7 @@
             </w:pPr>
             <w:r>
               <w:rPr>
-                <w:color w:val="4a5568"/>
+                <w:color w:val="404040"/>
                 <w:sz w:val="20"/>
               </w:rPr>
               <w:t>Microsoft Entra ID as single identity provider</w:t>
@@ -6108,7 +6108,7 @@
             </w:pPr>
             <w:r>
               <w:rPr>
-                <w:color w:val="4a5568"/>
+                <w:color w:val="404040"/>
                 <w:sz w:val="20"/>
               </w:rPr>
               <w:t>IM-2</w:t>
@@ -6126,7 +6126,7 @@
             </w:pPr>
             <w:r>
               <w:rPr>
-                <w:color w:val="4a5568"/>
+                <w:color w:val="404040"/>
                 <w:sz w:val="20"/>
               </w:rPr>
               <w:t>Protect Identity Systems</w:t>
@@ -6144,7 +6144,7 @@
             </w:pPr>
             <w:r>
               <w:rPr>
-                <w:color w:val="4a5568"/>
+                <w:color w:val="404040"/>
                 <w:sz w:val="20"/>
               </w:rPr>
               <w:t>Conditional Access; Identity Protection; PIM</w:t>
@@ -6164,7 +6164,7 @@
             </w:pPr>
             <w:r>
               <w:rPr>
-                <w:color w:val="4a5568"/>
+                <w:color w:val="404040"/>
                 <w:sz w:val="20"/>
               </w:rPr>
               <w:t>IM-3</w:t>
@@ -6182,7 +6182,7 @@
             </w:pPr>
             <w:r>
               <w:rPr>
-                <w:color w:val="4a5568"/>
+                <w:color w:val="404040"/>
                 <w:sz w:val="20"/>
               </w:rPr>
               <w:t>Application Identities</w:t>
@@ -6200,7 +6200,7 @@
             </w:pPr>
             <w:r>
               <w:rPr>
-                <w:color w:val="4a5568"/>
+                <w:color w:val="404040"/>
                 <w:sz w:val="20"/>
               </w:rPr>
               <w:t>Managed identities; service principal governance</w:t>
@@ -6220,7 +6220,7 @@
             </w:pPr>
             <w:r>
               <w:rPr>
-                <w:color w:val="4a5568"/>
+                <w:color w:val="404040"/>
                 <w:sz w:val="20"/>
               </w:rPr>
               <w:t>IM-4</w:t>
@@ -6238,7 +6238,7 @@
             </w:pPr>
             <w:r>
               <w:rPr>
-                <w:color w:val="4a5568"/>
+                <w:color w:val="404040"/>
                 <w:sz w:val="20"/>
               </w:rPr>
               <w:t>Server Authentication</w:t>
@@ -6256,7 +6256,7 @@
             </w:pPr>
             <w:r>
               <w:rPr>
-                <w:color w:val="4a5568"/>
+                <w:color w:val="404040"/>
                 <w:sz w:val="20"/>
               </w:rPr>
               <w:t>Certificate management; mTLS with Key Vault</w:t>
@@ -6276,7 +6276,7 @@
             </w:pPr>
             <w:r>
               <w:rPr>
-                <w:color w:val="4a5568"/>
+                <w:color w:val="404040"/>
                 <w:sz w:val="20"/>
               </w:rPr>
               <w:t>IM-5</w:t>
@@ -6294,7 +6294,7 @@
             </w:pPr>
             <w:r>
               <w:rPr>
-                <w:color w:val="4a5568"/>
+                <w:color w:val="404040"/>
                 <w:sz w:val="20"/>
               </w:rPr>
               <w:t>Single Sign-On</w:t>
@@ -6312,7 +6312,7 @@
             </w:pPr>
             <w:r>
               <w:rPr>
-                <w:color w:val="4a5568"/>
+                <w:color w:val="404040"/>
                 <w:sz w:val="20"/>
               </w:rPr>
               <w:t>Microsoft Entra SSO for all applications</w:t>
@@ -6332,7 +6332,7 @@
             </w:pPr>
             <w:r>
               <w:rPr>
-                <w:color w:val="4a5568"/>
+                <w:color w:val="404040"/>
                 <w:sz w:val="20"/>
               </w:rPr>
               <w:t>IM-6</w:t>
@@ -6350,7 +6350,7 @@
             </w:pPr>
             <w:r>
               <w:rPr>
-                <w:color w:val="4a5568"/>
+                <w:color w:val="404040"/>
                 <w:sz w:val="20"/>
               </w:rPr>
               <w:t>Strong Authentication</w:t>
@@ -6368,7 +6368,7 @@
             </w:pPr>
             <w:r>
               <w:rPr>
-                <w:color w:val="4a5568"/>
+                <w:color w:val="404040"/>
                 <w:sz w:val="20"/>
               </w:rPr>
               <w:t>MFA; FIDO2; passwordless authentication</w:t>
@@ -6388,7 +6388,7 @@
             </w:pPr>
             <w:r>
               <w:rPr>
-                <w:color w:val="4a5568"/>
+                <w:color w:val="404040"/>
                 <w:sz w:val="20"/>
               </w:rPr>
               <w:t>IM-7</w:t>
@@ -6406,7 +6406,7 @@
             </w:pPr>
             <w:r>
               <w:rPr>
-                <w:color w:val="4a5568"/>
+                <w:color w:val="404040"/>
                 <w:sz w:val="20"/>
               </w:rPr>
               <w:t>Conditional Access</w:t>
@@ -6424,7 +6424,7 @@
             </w:pPr>
             <w:r>
               <w:rPr>
-                <w:color w:val="4a5568"/>
+                <w:color w:val="404040"/>
                 <w:sz w:val="20"/>
               </w:rPr>
               <w:t>Location-based; device-based; risk-based policies</w:t>
@@ -6444,7 +6444,7 @@
             </w:pPr>
             <w:r>
               <w:rPr>
-                <w:color w:val="4a5568"/>
+                <w:color w:val="404040"/>
                 <w:sz w:val="20"/>
               </w:rPr>
               <w:t>IM-8</w:t>
@@ -6462,7 +6462,7 @@
             </w:pPr>
             <w:r>
               <w:rPr>
-                <w:color w:val="4a5568"/>
+                <w:color w:val="404040"/>
                 <w:sz w:val="20"/>
               </w:rPr>
               <w:t>Credential Protection</w:t>
@@ -6480,7 +6480,7 @@
             </w:pPr>
             <w:r>
               <w:rPr>
-                <w:color w:val="4a5568"/>
+                <w:color w:val="404040"/>
                 <w:sz w:val="20"/>
               </w:rPr>
               <w:t>Key Vault; secret rotation; no credentials in code</w:t>
@@ -6500,7 +6500,7 @@
             </w:pPr>
             <w:r>
               <w:rPr>
-                <w:color w:val="4a5568"/>
+                <w:color w:val="404040"/>
                 <w:sz w:val="20"/>
               </w:rPr>
               <w:t>PA-1</w:t>
@@ -6518,7 +6518,7 @@
             </w:pPr>
             <w:r>
               <w:rPr>
-                <w:color w:val="4a5568"/>
+                <w:color w:val="404040"/>
                 <w:sz w:val="20"/>
               </w:rPr>
               <w:t>Separate Privileged Users</w:t>
@@ -6536,7 +6536,7 @@
             </w:pPr>
             <w:r>
               <w:rPr>
-                <w:color w:val="4a5568"/>
+                <w:color w:val="404040"/>
                 <w:sz w:val="20"/>
               </w:rPr>
               <w:t>PIM; dedicated admin accounts; approval workflows</w:t>
@@ -6556,7 +6556,7 @@
             </w:pPr>
             <w:r>
               <w:rPr>
-                <w:color w:val="4a5568"/>
+                <w:color w:val="404040"/>
                 <w:sz w:val="20"/>
               </w:rPr>
               <w:t>PA-2</w:t>
@@ -6574,7 +6574,7 @@
             </w:pPr>
             <w:r>
               <w:rPr>
-                <w:color w:val="4a5568"/>
+                <w:color w:val="404040"/>
                 <w:sz w:val="20"/>
               </w:rPr>
               <w:t>Avoid Standing Access</w:t>
@@ -6592,7 +6592,7 @@
             </w:pPr>
             <w:r>
               <w:rPr>
-                <w:color w:val="4a5568"/>
+                <w:color w:val="404040"/>
                 <w:sz w:val="20"/>
               </w:rPr>
               <w:t>Just-in-time access; time-bound activation</w:t>
@@ -6612,7 +6612,7 @@
             </w:pPr>
             <w:r>
               <w:rPr>
-                <w:color w:val="4a5568"/>
+                <w:color w:val="404040"/>
                 <w:sz w:val="20"/>
               </w:rPr>
               <w:t>PA-3</w:t>
@@ -6630,7 +6630,7 @@
             </w:pPr>
             <w:r>
               <w:rPr>
-                <w:color w:val="4a5568"/>
+                <w:color w:val="404040"/>
                 <w:sz w:val="20"/>
               </w:rPr>
               <w:t>Identity Lifecycle</w:t>
@@ -6648,7 +6648,7 @@
             </w:pPr>
             <w:r>
               <w:rPr>
-                <w:color w:val="4a5568"/>
+                <w:color w:val="404040"/>
                 <w:sz w:val="20"/>
               </w:rPr>
               <w:t>Automated provisioning/deprovisioning; access reviews</w:t>
@@ -6668,7 +6668,7 @@
             </w:pPr>
             <w:r>
               <w:rPr>
-                <w:color w:val="4a5568"/>
+                <w:color w:val="404040"/>
                 <w:sz w:val="20"/>
               </w:rPr>
               <w:t>PA-4</w:t>
@@ -6686,7 +6686,7 @@
             </w:pPr>
             <w:r>
               <w:rPr>
-                <w:color w:val="4a5568"/>
+                <w:color w:val="404040"/>
                 <w:sz w:val="20"/>
               </w:rPr>
               <w:t>Regular Access Reviews</w:t>
@@ -6704,7 +6704,7 @@
             </w:pPr>
             <w:r>
               <w:rPr>
-                <w:color w:val="4a5568"/>
+                <w:color w:val="404040"/>
                 <w:sz w:val="20"/>
               </w:rPr>
               <w:t>Quarterly access reviews; PIM audit reports</w:t>
@@ -6724,7 +6724,7 @@
             </w:pPr>
             <w:r>
               <w:rPr>
-                <w:color w:val="4a5568"/>
+                <w:color w:val="404040"/>
                 <w:sz w:val="20"/>
               </w:rPr>
               <w:t>PA-5</w:t>
@@ -6742,7 +6742,7 @@
             </w:pPr>
             <w:r>
               <w:rPr>
-                <w:color w:val="4a5568"/>
+                <w:color w:val="404040"/>
                 <w:sz w:val="20"/>
               </w:rPr>
               <w:t>Emergency Access</w:t>
@@ -6760,7 +6760,7 @@
             </w:pPr>
             <w:r>
               <w:rPr>
-                <w:color w:val="4a5568"/>
+                <w:color w:val="404040"/>
                 <w:sz w:val="20"/>
               </w:rPr>
               <w:t>Break-glass accounts with monitoring and alerting</w:t>
@@ -6780,7 +6780,7 @@
             </w:pPr>
             <w:r>
               <w:rPr>
-                <w:color w:val="4a5568"/>
+                <w:color w:val="404040"/>
                 <w:sz w:val="20"/>
               </w:rPr>
               <w:t>PA-6</w:t>
@@ -6798,7 +6798,7 @@
             </w:pPr>
             <w:r>
               <w:rPr>
-                <w:color w:val="4a5568"/>
+                <w:color w:val="404040"/>
                 <w:sz w:val="20"/>
               </w:rPr>
               <w:t>Privileged Access Solution</w:t>
@@ -6816,7 +6816,7 @@
             </w:pPr>
             <w:r>
               <w:rPr>
-                <w:color w:val="4a5568"/>
+                <w:color w:val="404040"/>
                 <w:sz w:val="20"/>
               </w:rPr>
               <w:t>PIM with approval workflows and MFA</w:t>
@@ -6836,7 +6836,7 @@
             </w:pPr>
             <w:r>
               <w:rPr>
-                <w:color w:val="4a5568"/>
+                <w:color w:val="404040"/>
                 <w:sz w:val="20"/>
               </w:rPr>
               <w:t>PA-7</w:t>
@@ -6854,7 +6854,7 @@
             </w:pPr>
             <w:r>
               <w:rPr>
-                <w:color w:val="4a5568"/>
+                <w:color w:val="404040"/>
                 <w:sz w:val="20"/>
               </w:rPr>
               <w:t>Least Privilege</w:t>
@@ -6872,7 +6872,7 @@
             </w:pPr>
             <w:r>
               <w:rPr>
-                <w:color w:val="4a5568"/>
+                <w:color w:val="404040"/>
                 <w:sz w:val="20"/>
               </w:rPr>
               <w:t>RBAC with minimal permissions; regular review</w:t>
@@ -6892,7 +6892,7 @@
             </w:pPr>
             <w:r>
               <w:rPr>
-                <w:color w:val="4a5568"/>
+                <w:color w:val="404040"/>
                 <w:sz w:val="20"/>
               </w:rPr>
               <w:t>BR-1</w:t>
@@ -6910,7 +6910,7 @@
             </w:pPr>
             <w:r>
               <w:rPr>
-                <w:color w:val="4a5568"/>
+                <w:color w:val="404040"/>
                 <w:sz w:val="20"/>
               </w:rPr>
               <w:t>Automated Backups</w:t>
@@ -6928,7 +6928,7 @@
             </w:pPr>
             <w:r>
               <w:rPr>
-                <w:color w:val="4a5568"/>
+                <w:color w:val="404040"/>
                 <w:sz w:val="20"/>
               </w:rPr>
               <w:t>Azure Backup; backup policies via Azure Policy</w:t>
@@ -6948,7 +6948,7 @@
             </w:pPr>
             <w:r>
               <w:rPr>
-                <w:color w:val="4a5568"/>
+                <w:color w:val="404040"/>
                 <w:sz w:val="20"/>
               </w:rPr>
               <w:t>BR-2</w:t>
@@ -6966,7 +6966,7 @@
             </w:pPr>
             <w:r>
               <w:rPr>
-                <w:color w:val="4a5568"/>
+                <w:color w:val="404040"/>
                 <w:sz w:val="20"/>
               </w:rPr>
               <w:t>Protect Backup Data</w:t>
@@ -6984,7 +6984,7 @@
             </w:pPr>
             <w:r>
               <w:rPr>
-                <w:color w:val="4a5568"/>
+                <w:color w:val="404040"/>
                 <w:sz w:val="20"/>
               </w:rPr>
               <w:t>Encryption; geo-redundant storage; soft delete</w:t>
@@ -7004,7 +7004,7 @@
             </w:pPr>
             <w:r>
               <w:rPr>
-                <w:color w:val="4a5568"/>
+                <w:color w:val="404040"/>
                 <w:sz w:val="20"/>
               </w:rPr>
               <w:t>BR-3</w:t>
@@ -7022,7 +7022,7 @@
             </w:pPr>
             <w:r>
               <w:rPr>
-                <w:color w:val="4a5568"/>
+                <w:color w:val="404040"/>
                 <w:sz w:val="20"/>
               </w:rPr>
               <w:t>Monitor Backups</w:t>
@@ -7040,7 +7040,7 @@
             </w:pPr>
             <w:r>
               <w:rPr>
-                <w:color w:val="4a5568"/>
+                <w:color w:val="404040"/>
                 <w:sz w:val="20"/>
               </w:rPr>
               <w:t>Azure Monitor alerts for backup failures</w:t>
@@ -7060,7 +7060,7 @@
             </w:pPr>
             <w:r>
               <w:rPr>
-                <w:color w:val="4a5568"/>
+                <w:color w:val="404040"/>
                 <w:sz w:val="20"/>
               </w:rPr>
               <w:t>BR-4</w:t>
@@ -7078,7 +7078,7 @@
             </w:pPr>
             <w:r>
               <w:rPr>
-                <w:color w:val="4a5568"/>
+                <w:color w:val="404040"/>
                 <w:sz w:val="20"/>
               </w:rPr>
               <w:t>Test Backup Recovery</w:t>
@@ -7096,7 +7096,7 @@
             </w:pPr>
             <w:r>
               <w:rPr>
-                <w:color w:val="4a5568"/>
+                <w:color w:val="404040"/>
                 <w:sz w:val="20"/>
               </w:rPr>
               <w:t>Regular restore drills; documented procedures</w:t>
@@ -7116,7 +7116,7 @@
             </w:pPr>
             <w:r>
               <w:rPr>
-                <w:color w:val="4a5568"/>
+                <w:color w:val="404040"/>
                 <w:sz w:val="20"/>
               </w:rPr>
               <w:t>DS-1</w:t>
@@ -7134,7 +7134,7 @@
             </w:pPr>
             <w:r>
               <w:rPr>
-                <w:color w:val="4a5568"/>
+                <w:color w:val="404040"/>
                 <w:sz w:val="20"/>
               </w:rPr>
               <w:t>Threat Modeling</w:t>
@@ -7152,7 +7152,7 @@
             </w:pPr>
             <w:r>
               <w:rPr>
-                <w:color w:val="4a5568"/>
+                <w:color w:val="404040"/>
                 <w:sz w:val="20"/>
               </w:rPr>
               <w:t>Microsoft Threat Modeling Tool; STRIDE methodology</w:t>
@@ -7172,7 +7172,7 @@
             </w:pPr>
             <w:r>
               <w:rPr>
-                <w:color w:val="4a5568"/>
+                <w:color w:val="404040"/>
                 <w:sz w:val="20"/>
               </w:rPr>
               <w:t>DS-2</w:t>
@@ -7190,7 +7190,7 @@
             </w:pPr>
             <w:r>
               <w:rPr>
-                <w:color w:val="4a5568"/>
+                <w:color w:val="404040"/>
                 <w:sz w:val="20"/>
               </w:rPr>
               <w:t>Secure Supply Chain</w:t>
@@ -7208,7 +7208,7 @@
             </w:pPr>
             <w:r>
               <w:rPr>
-                <w:color w:val="4a5568"/>
+                <w:color w:val="404040"/>
                 <w:sz w:val="20"/>
               </w:rPr>
               <w:t>Azure DevOps security; artifact signing</w:t>
@@ -7228,7 +7228,7 @@
             </w:pPr>
             <w:r>
               <w:rPr>
-                <w:color w:val="4a5568"/>
+                <w:color w:val="404040"/>
                 <w:sz w:val="20"/>
               </w:rPr>
               <w:t>DS-3</w:t>
@@ -7246,7 +7246,7 @@
             </w:pPr>
             <w:r>
               <w:rPr>
-                <w:color w:val="4a5568"/>
+                <w:color w:val="404040"/>
                 <w:sz w:val="20"/>
               </w:rPr>
               <w:t>Secure DevOps Infra</w:t>
@@ -7264,7 +7264,7 @@
             </w:pPr>
             <w:r>
               <w:rPr>
-                <w:color w:val="4a5568"/>
+                <w:color w:val="404040"/>
                 <w:sz w:val="20"/>
               </w:rPr>
               <w:t>Private agents; secure pipeline variables</w:t>
@@ -7284,7 +7284,7 @@
             </w:pPr>
             <w:r>
               <w:rPr>
-                <w:color w:val="4a5568"/>
+                <w:color w:val="404040"/>
                 <w:sz w:val="20"/>
               </w:rPr>
               <w:t>DS-6</w:t>
@@ -7302,7 +7302,7 @@
             </w:pPr>
             <w:r>
               <w:rPr>
-                <w:color w:val="4a5568"/>
+                <w:color w:val="404040"/>
                 <w:sz w:val="20"/>
               </w:rPr>
               <w:t>Workload Lifecycle</w:t>
@@ -7320,7 +7320,7 @@
             </w:pPr>
             <w:r>
               <w:rPr>
-                <w:color w:val="4a5568"/>
+                <w:color w:val="404040"/>
                 <w:sz w:val="20"/>
               </w:rPr>
               <w:t>IaC; canary deployments; automated rollback</w:t>
@@ -7340,7 +7340,7 @@
             </w:pPr>
             <w:r>
               <w:rPr>
-                <w:color w:val="4a5568"/>
+                <w:color w:val="404040"/>
                 <w:sz w:val="20"/>
               </w:rPr>
               <w:t>DS-7</w:t>
@@ -7358,7 +7358,7 @@
             </w:pPr>
             <w:r>
               <w:rPr>
-                <w:color w:val="4a5568"/>
+                <w:color w:val="404040"/>
                 <w:sz w:val="20"/>
               </w:rPr>
               <w:t>DevOps Logging</w:t>
@@ -7376,7 +7376,7 @@
             </w:pPr>
             <w:r>
               <w:rPr>
-                <w:color w:val="4a5568"/>
+                <w:color w:val="404040"/>
                 <w:sz w:val="20"/>
               </w:rPr>
               <w:t>Pipeline diagnostics; audit logs; Sentinel integration</w:t>
@@ -7860,9 +7860,9 @@
       <w:tblPr>
         <w:tblW w:w="5000" w:type="pct"/>
         <w:tblBorders>
-          <w:top w:val="single" w:color="1e3a5f" w:sz="12"/>
-          <w:bottom w:val="single" w:color="1e3a5f" w:sz="12"/>
-          <w:insideH w:val="single" w:color="cbd5e0" w:sz="4"/>
+          <w:top w:val="single" w:color="5F2861" w:sz="12"/>
+          <w:bottom w:val="single" w:color="5F2861" w:sz="12"/>
+          <w:insideH w:val="single" w:color="D9D9D9" w:sz="4"/>
         </w:tblBorders>
       </w:tblPr>
       <w:tblGrid>
@@ -7876,7 +7876,7 @@
         <w:tc>
           <w:tcPr>
             <w:tcW w:w="2800" w:type="dxa"/>
-            <w:shd w:val="clear" w:fill="e8eef4"/>
+            <w:shd w:val="clear" w:fill="F2EEF2"/>
           </w:tcPr>
           <w:p>
             <w:pPr>
@@ -7896,7 +7896,7 @@
         <w:tc>
           <w:tcPr>
             <w:tcW w:w="7200" w:type="dxa"/>
-            <w:shd w:val="clear" w:fill="e8eef4"/>
+            <w:shd w:val="clear" w:fill="F2EEF2"/>
           </w:tcPr>
           <w:p>
             <w:pPr>
@@ -7926,7 +7926,7 @@
             </w:pPr>
             <w:r>
               <w:rPr>
-                <w:color w:val="4a5568"/>
+                <w:color w:val="404040"/>
                 <w:sz w:val="20"/>
               </w:rPr>
               <w:t>Tenant &amp; Billing</w:t>
@@ -7944,7 +7944,7 @@
             </w:pPr>
             <w:r>
               <w:rPr>
-                <w:color w:val="4a5568"/>
+                <w:color w:val="404040"/>
                 <w:sz w:val="20"/>
               </w:rPr>
               <w:t>Enrollment verified; cost owner documented; incident contacts set</w:t>
@@ -7964,7 +7964,7 @@
             </w:pPr>
             <w:r>
               <w:rPr>
-                <w:color w:val="4a5568"/>
+                <w:color w:val="404040"/>
                 <w:sz w:val="20"/>
               </w:rPr>
               <w:t>Identity &amp; Access</w:t>
@@ -7982,7 +7982,7 @@
             </w:pPr>
             <w:r>
               <w:rPr>
-                <w:color w:val="4a5568"/>
+                <w:color w:val="404040"/>
                 <w:sz w:val="20"/>
               </w:rPr>
               <w:t>PIM + MFA enforced; break-glass tested; RBAC model documented</w:t>
@@ -8002,7 +8002,7 @@
             </w:pPr>
             <w:r>
               <w:rPr>
-                <w:color w:val="4a5568"/>
+                <w:color w:val="404040"/>
                 <w:sz w:val="20"/>
               </w:rPr>
               <w:t>Resource Organization</w:t>
@@ -8020,7 +8020,7 @@
             </w:pPr>
             <w:r>
               <w:rPr>
-                <w:color w:val="4a5568"/>
+                <w:color w:val="404040"/>
                 <w:sz w:val="20"/>
               </w:rPr>
               <w:t>MG hierarchy deployed; subscription vending live; tags enforced</w:t>
@@ -8040,7 +8040,7 @@
             </w:pPr>
             <w:r>
               <w:rPr>
-                <w:color w:val="4a5568"/>
+                <w:color w:val="404040"/>
                 <w:sz w:val="20"/>
               </w:rPr>
               <w:t>Network</w:t>
@@ -8058,7 +8058,7 @@
             </w:pPr>
             <w:r>
               <w:rPr>
-                <w:color w:val="4a5568"/>
+                <w:color w:val="404040"/>
                 <w:sz w:val="20"/>
               </w:rPr>
               <w:t>Topology deployed; DNS standardized; hybrid links resilient</w:t>
@@ -8078,7 +8078,7 @@
             </w:pPr>
             <w:r>
               <w:rPr>
-                <w:color w:val="4a5568"/>
+                <w:color w:val="404040"/>
                 <w:sz w:val="20"/>
               </w:rPr>
               <w:t>Security</w:t>
@@ -8096,7 +8096,7 @@
             </w:pPr>
             <w:r>
               <w:rPr>
-                <w:color w:val="4a5568"/>
+                <w:color w:val="404040"/>
                 <w:sz w:val="20"/>
               </w:rPr>
               <w:t>Defender plans scoped; Sentinel strategy defined; secrets hygiene</w:t>
@@ -8116,7 +8116,7 @@
             </w:pPr>
             <w:r>
               <w:rPr>
-                <w:color w:val="4a5568"/>
+                <w:color w:val="404040"/>
                 <w:sz w:val="20"/>
               </w:rPr>
               <w:t>Management</w:t>
@@ -8134,7 +8134,7 @@
             </w:pPr>
             <w:r>
               <w:rPr>
-                <w:color w:val="4a5568"/>
+                <w:color w:val="404040"/>
                 <w:sz w:val="20"/>
               </w:rPr>
               <w:t>LAW with AMA DCRs; update/backup policies assigned</w:t>
@@ -8154,7 +8154,7 @@
             </w:pPr>
             <w:r>
               <w:rPr>
-                <w:color w:val="4a5568"/>
+                <w:color w:val="404040"/>
                 <w:sz w:val="20"/>
               </w:rPr>
               <w:t>Governance</w:t>
@@ -8172,7 +8172,7 @@
             </w:pPr>
             <w:r>
               <w:rPr>
-                <w:color w:val="4a5568"/>
+                <w:color w:val="404040"/>
                 <w:sz w:val="20"/>
               </w:rPr>
               <w:t>Regulatory initiatives assigned; exemption workflow; drift report</w:t>
@@ -8192,7 +8192,7 @@
             </w:pPr>
             <w:r>
               <w:rPr>
-                <w:color w:val="4a5568"/>
+                <w:color w:val="404040"/>
                 <w:sz w:val="20"/>
               </w:rPr>
               <w:t>Automation &amp; DevOps</w:t>
@@ -8210,7 +8210,7 @@
             </w:pPr>
             <w:r>
               <w:rPr>
-                <w:color w:val="4a5568"/>
+                <w:color w:val="404040"/>
                 <w:sz w:val="20"/>
               </w:rPr>
               <w:t>ALZ Accelerator + AVM in CI/CD; canary environment deployed</w:t>
@@ -8282,7 +8282,7 @@
       <w:r>
         <w:rPr>
           <w:b/>
-          <w:color w:val="1e3a5f"/>
+          <w:color w:val="7030A0"/>
           <w:sz w:val="48"/>
         </w:rPr>
         <w:t>Azure Landing Zone Design Template</w:t>
@@ -8295,7 +8295,7 @@
       </w:pPr>
       <w:r>
         <w:rPr>
-          <w:color w:val="4a5568"/>
+          <w:color w:val="404040"/>
           <w:sz w:val="22"/>
         </w:rPr>
         <w:t>Microsoft Cloud Adoption Framework</w:t>
@@ -8308,7 +8308,7 @@
       </w:pPr>
       <w:r>
         <w:rPr>
-          <w:color w:val="718096"/>
+          <w:color w:val="646464"/>
           <w:sz w:val="18"/>
         </w:rPr>
         <w:t>CIS Controls v8.1 Implementation Guide</w:t>
@@ -8321,7 +8321,7 @@
       </w:pPr>
       <w:r>
         <w:rPr>
-          <w:color w:val="718096"/>
+          <w:color w:val="646464"/>
           <w:sz w:val="16"/>
         </w:rPr>
         <w:t>May 2026 Edition</w:t>
@@ -8343,84 +8343,84 @@
     </w:pPr>
     <w:r>
       <w:rPr>
-        <w:color w:val="718096"/>
+        <w:color w:val="646464"/>
         <w:sz w:val="18"/>
       </w:rPr>
       <w:t xml:space="preserve">Page </w:t>
     </w:r>
     <w:r>
       <w:rPr>
-        <w:color w:val="718096"/>
+        <w:color w:val="646464"/>
         <w:sz w:val="18"/>
       </w:rPr>
       <w:fldChar w:fldCharType="begin"/>
     </w:r>
     <w:r>
       <w:rPr>
-        <w:color w:val="718096"/>
+        <w:color w:val="646464"/>
         <w:sz w:val="18"/>
       </w:rPr>
       <w:instrText xml:space="preserve"> PAGE </w:instrText>
     </w:r>
     <w:r>
       <w:rPr>
-        <w:color w:val="718096"/>
+        <w:color w:val="646464"/>
         <w:sz w:val="18"/>
       </w:rPr>
       <w:fldChar w:fldCharType="separate"/>
     </w:r>
     <w:r>
       <w:rPr>
-        <w:color w:val="718096"/>
+        <w:color w:val="646464"/>
         <w:sz w:val="18"/>
       </w:rPr>
       <w:t>1</w:t>
     </w:r>
     <w:r>
       <w:rPr>
-        <w:color w:val="718096"/>
+        <w:color w:val="646464"/>
         <w:sz w:val="18"/>
       </w:rPr>
       <w:fldChar w:fldCharType="end"/>
     </w:r>
     <w:r>
       <w:rPr>
-        <w:color w:val="718096"/>
+        <w:color w:val="646464"/>
         <w:sz w:val="18"/>
       </w:rPr>
       <w:t xml:space="preserve"> of </w:t>
     </w:r>
     <w:r>
       <w:rPr>
-        <w:color w:val="718096"/>
+        <w:color w:val="646464"/>
         <w:sz w:val="18"/>
       </w:rPr>
       <w:fldChar w:fldCharType="begin"/>
     </w:r>
     <w:r>
       <w:rPr>
-        <w:color w:val="718096"/>
+        <w:color w:val="646464"/>
         <w:sz w:val="18"/>
       </w:rPr>
       <w:instrText xml:space="preserve"> NUMPAGES </w:instrText>
     </w:r>
     <w:r>
       <w:rPr>
-        <w:color w:val="718096"/>
+        <w:color w:val="646464"/>
         <w:sz w:val="18"/>
       </w:rPr>
       <w:fldChar w:fldCharType="separate"/>
     </w:r>
     <w:r>
       <w:rPr>
-        <w:color w:val="718096"/>
+        <w:color w:val="646464"/>
         <w:sz w:val="18"/>
       </w:rPr>
       <w:t>1</w:t>
     </w:r>
     <w:r>
       <w:rPr>
-        <w:color w:val="718096"/>
+        <w:color w:val="646464"/>
         <w:sz w:val="18"/>
       </w:rPr>
       <w:fldChar w:fldCharType="end"/>
@@ -8482,7 +8482,7 @@
     </w:pPr>
     <w:r>
       <w:rPr>
-        <w:color w:val="718096"/>
+        <w:color w:val="646464"/>
         <w:sz w:val="18"/>
       </w:rPr>
       <w:t>Azure Landing Zone Design Template</w:t>
@@ -8534,7 +8534,7 @@
     <w:rPr>
       <w:rFonts w:ascii="Calibri" w:hAnsi="Calibri" w:eastAsia="Microsoft YaHei"/>
       <w:b/>
-      <w:color w:val="1e3a5f"/>
+      <w:color w:val="7030A0"/>
       <w:sz w:val="40"/>
     </w:rPr>
   </w:style>
@@ -8550,7 +8550,7 @@
     <w:rPr>
       <w:rFonts w:ascii="Calibri" w:hAnsi="Calibri" w:eastAsia="Microsoft YaHei"/>
       <w:b/>
-      <w:color w:val="1a202c"/>
+      <w:color w:val="7030A0"/>
       <w:sz w:val="28"/>
     </w:rPr>
   </w:style>
@@ -8566,7 +8566,7 @@
     <w:rPr>
       <w:rFonts w:ascii="Calibri" w:hAnsi="Calibri" w:eastAsia="Microsoft YaHei"/>
       <w:b/>
-      <w:color w:val="4a5568"/>
+      <w:color w:val="404040"/>
       <w:sz w:val="24"/>
     </w:rPr>
   </w:style>
@@ -8578,7 +8578,7 @@
       <w:jc w:val="center"/>
     </w:pPr>
     <w:rPr>
-      <w:color w:val="718096"/>
+      <w:color w:val="646464"/>
       <w:sz w:val="20"/>
     </w:rPr>
   </w:style>
@@ -8608,7 +8608,7 @@
       <w:ind w:left="360"/>
     </w:pPr>
     <w:rPr>
-      <w:color w:val="4a5568"/>
+      <w:color w:val="404040"/>
     </w:rPr>
   </w:style>
   <w:style w:type="paragraph" w:styleId="TOC3">
@@ -8622,7 +8622,7 @@
       <w:ind w:left="720"/>
     </w:pPr>
     <w:rPr>
-      <w:color w:val="4a5568"/>
+      <w:color w:val="404040"/>
     </w:rPr>
   </w:style>
 </w:styles>

</xml_diff>